<commit_message>
Film du mécanisme réduit à la scène « Manettes ouvertes ou fermées ? » (11 s, FR, EN) ; répliques validées et plan d'intégration mis à jour dans le script Word
Co-Authored-By: Claude Opus 5.5 <noreply@anthropic.com>
Claude-Session: https://claude.ai/code/session_016YnqtNNUyZYY3JuA5BfKCG
</commit_message>
<xml_diff>
--- a/video/Script_PRO-OP-DD-005_mecanisme.docx
+++ b/video/Script_PRO-OP-DD-005_mecanisme.docx
@@ -53,7 +53,7 @@
           <w:color w:val="1E7B34"/>
           <w:u w:val="single" w:color="1E7B34"/>
         </w:rPr>
-        <w:t xml:space="preserve">texte ajouté</w:t>
+        <w:t xml:space="preserve">texte ajouté (validé)</w:t>
       </w:r>
       <w:r>
         <w:rPr>
@@ -138,7 +138,7 @@
           <w:rFonts w:ascii="Arial" w:cs="Arial" w:eastAsia="Arial" w:hAnsi="Arial"/>
           <w:color w:val="595959"/>
         </w:rPr>
-        <w:t xml:space="preserve">      5 répliques ajoutées</w:t>
+        <w:t xml:space="preserve">      5 répliques ajoutées, validées</w:t>
       </w:r>
     </w:p>
     <w:p>
@@ -447,7 +447,7 @@
                 <w:sz w:val="19"/>
                 <w:szCs w:val="19"/>
               </w:rPr>
-              <w:t xml:space="preserve">Film du mécanisme : extérieur 2,5 s, mécanisme en action 10 s, + les 18 ressorts 7 s, + le boîtier 5,5 s</w:t>
+              <w:t xml:space="preserve">Scène « Manettes ouvertes ou fermées ? » (11 s) : ouvertes (rouge) puis fermées (vert), cartes, ralentie pour suivre la voix</w:t>
             </w:r>
           </w:p>
         </w:tc>
@@ -473,7 +473,7 @@
                 <w:sz w:val="19"/>
                 <w:szCs w:val="19"/>
               </w:rPr>
-              <w:t xml:space="preserve">≈ 25 s</w:t>
+              <w:t xml:space="preserve">≈ 22 s</w:t>
             </w:r>
           </w:p>
         </w:tc>
@@ -499,7 +499,7 @@
                 <w:sz w:val="19"/>
                 <w:szCs w:val="19"/>
               </w:rPr>
-              <w:t xml:space="preserve">5 nouvelles répliques (à enregistrer)</w:t>
+              <w:t xml:space="preserve">5 répliques validées, à enregistrer</w:t>
             </w:r>
           </w:p>
         </w:tc>
@@ -609,7 +609,7 @@
                 <w:sz w:val="19"/>
                 <w:szCs w:val="19"/>
               </w:rPr>
-              <w:t xml:space="preserve">Plan « Manettes ouvertes ou fermées ? » (9 s), ralenti au besoin pour suivre la voix</w:t>
+              <w:t xml:space="preserve">Images actuelles de l’étape 1 (coupe)</w:t>
             </w:r>
           </w:p>
         </w:tc>
@@ -743,7 +743,7 @@
                 <w:sz w:val="19"/>
                 <w:szCs w:val="19"/>
               </w:rPr>
-              <w:t xml:space="preserve">Partout où le film du mécanisme est utilisé</w:t>
+              <w:t xml:space="preserve">Pendant la nouvelle séquence</w:t>
             </w:r>
           </w:p>
         </w:tc>
@@ -931,7 +931,7 @@
                 <w:sz w:val="19"/>
                 <w:szCs w:val="19"/>
               </w:rPr>
-              <w:t xml:space="preserve">5 min 37 s aujourd’hui → environ 6 min 20 s</w:t>
+              <w:t xml:space="preserve">5 min 37 s aujourd’hui → environ 6 min 15 s</w:t>
             </w:r>
           </w:p>
         </w:tc>
@@ -958,7 +958,7 @@
                 <w:sz w:val="19"/>
                 <w:szCs w:val="19"/>
               </w:rPr>
-              <w:t xml:space="preserve">+ ≈ 42 s</w:t>
+              <w:t xml:space="preserve">+ ≈ 39 s</w:t>
             </w:r>
           </w:p>
         </w:tc>
@@ -1091,7 +1091,7 @@
                 <w:sz w:val="19"/>
                 <w:szCs w:val="19"/>
               </w:rPr>
-              <w:t xml:space="preserve">Film du mécanisme en anglais (déjà prêt)</w:t>
+              <w:t xml:space="preserve">Scène en anglais (déjà prête)</w:t>
             </w:r>
           </w:p>
         </w:tc>
@@ -1369,7 +1369,7 @@
           <w:bCs/>
           <w:color w:val="1F4E79"/>
         </w:rPr>
-        <w:t xml:space="preserve">🎬 NOUVELLE SÉQUENCE — film du mécanisme : </w:t>
+        <w:t xml:space="preserve">🎬 NOUVELLE SÉQUENCE — scène « Manettes ouvertes ou fermées ? » : </w:t>
       </w:r>
       <w:r>
         <w:rPr>
@@ -1377,7 +1377,7 @@
           <w:i/>
           <w:iCs/>
         </w:rPr>
-        <w:t xml:space="preserve">« Le mécanisme en action » en coupe (10 s), puis « + les 18 ressorts » (7 s) et « + le boîtier » (5 s). </w:t>
+        <w:t xml:space="preserve">mécanisme en coupe, ressorts soulignés. Manettes ouvertes (écran rouge, carte « le cadenas n’y change rien ») sous les répliques 1 et 2, </w:t>
       </w:r>
       <w:r>
         <w:rPr>
@@ -1386,7 +1386,7 @@
           <w:iCs/>
           <w:color w:val="595959"/>
         </w:rPr>
-        <w:t xml:space="preserve">Écran rouge = manettes ouvertes, écran vert = manettes fermées. Environ 25 s, sous les 5 répliques ci-dessous.</w:t>
+        <w:t xml:space="preserve">manettes fermées (écran vert) sous la réplique 3, carte « Avant de cadenasser : manettes fermées » sous les répliques 4 et 5. Scène de 11 s, ralentie et arrêtée sur image pour suivre la voix (≈ 22 s).</w:t>
       </w:r>
     </w:p>
     <w:p>
@@ -1604,7 +1604,7 @@
           <w:bCs/>
           <w:color w:val="1F4E79"/>
         </w:rPr>
-        <w:t xml:space="preserve">🎬 IMAGE CHANGÉE — pendant « Pourquoi fermées ? » : </w:t>
+        <w:t xml:space="preserve">🎬 IMAGES — étape 1, « Pourquoi fermées ? » : </w:t>
       </w:r>
       <w:r>
         <w:rPr>
@@ -1612,7 +1612,7 @@
           <w:i/>
           <w:iCs/>
         </w:rPr>
-        <w:t xml:space="preserve">plan « Manettes ouvertes ou fermées ? » du film du mécanisme. </w:t>
+        <w:t xml:space="preserve">images actuelles de l’étape 1 (coupe du mandrin). </w:t>
       </w:r>
       <w:r>
         <w:rPr>
@@ -1621,7 +1621,7 @@
           <w:iCs/>
           <w:color w:val="595959"/>
         </w:rPr>
-        <w:t xml:space="preserve">Écran rouge et carte « Manettes ouvertes : le cadenas n’y change rien », puis écran vert et carte « Manettes fermées : le moins d’énergie ».</w:t>
+        <w:t xml:space="preserve">La scène « Manettes ouvertes ou fermées ? » est déjà montrée juste avant, dans la nouvelle séquence.</w:t>
       </w:r>
     </w:p>
     <w:p>

</xml_diff>

<commit_message>
Vidéo 1 : 20 dernières secondes du film du mécanisme avant l'étape 1 (5 min 57 s), script mis à jour
Séquence insérée à 0:17,75 pendant le silence avant l'étape 1, fondus de 0,5 s, sans voix
pour l'instant (5 répliques validées à enregistrer) ; script Word : séquence, temps décalés, plan.

Co-Authored-By: Claude Opus 5.5 <noreply@anthropic.com>
Claude-Session: https://claude.ai/code/session_016YnqtNNUyZYY3JuA5BfKCG
</commit_message>
<xml_diff>
--- a/video/Script_PRO-OP-DD-005_mecanisme.docx
+++ b/video/Script_PRO-OP-DD-005_mecanisme.docx
@@ -30,7 +30,7 @@
           <w:sz w:val="20"/>
           <w:szCs w:val="20"/>
         </w:rPr>
-        <w:t xml:space="preserve">Vidéo 1 avec le film du mécanisme intégré. Comparé au dernier script validé (étape 1 « Pourquoi fermées ? » comprise). Le temps entre crochets indique où la réplique commence dans la vidéo en ligne (5 min 37 s).</w:t>
+        <w:t xml:space="preserve">Vidéo 1 avec les 20 dernières secondes du film du mécanisme intégrées avant l’étape 1. Comparé au dernier script validé (étape 1 « Pourquoi fermées ? » comprise). Le temps entre crochets indique où la réplique commence dans la vidéo en ligne (5 min 57 s, séquence du mécanisme comprise).</w:t>
       </w:r>
     </w:p>
     <w:p>
@@ -395,7 +395,7 @@
                 <w:sz w:val="19"/>
                 <w:szCs w:val="19"/>
               </w:rPr>
-              <w:t xml:space="preserve">Nouvelle séquence « Comment fonctionne le mandrin »</w:t>
+              <w:t xml:space="preserve">Séquence « Comment fonctionne le mandrin » — FAITE</w:t>
             </w:r>
           </w:p>
         </w:tc>
@@ -421,7 +421,7 @@
                 <w:sz w:val="19"/>
                 <w:szCs w:val="19"/>
               </w:rPr>
-              <w:t xml:space="preserve">Après l’intro (vers 0:15), juste avant l’étape 1</w:t>
+              <w:t xml:space="preserve">Après l’intro, à 0:17, juste avant l’étape 1</w:t>
             </w:r>
           </w:p>
         </w:tc>
@@ -447,7 +447,7 @@
                 <w:sz w:val="19"/>
                 <w:szCs w:val="19"/>
               </w:rPr>
-              <w:t xml:space="preserve">Scène « Manettes ouvertes ou fermées ? » (11 s) : ouvertes (rouge) puis fermées (vert), cartes, ralentie pour suivre la voix</w:t>
+              <w:t xml:space="preserve">20 dernières secondes du film du mécanisme : boîtier en 360°, glissé vers la coupe, manettes ouvertes (rouge) puis fermées (vert), cartes</w:t>
             </w:r>
           </w:p>
         </w:tc>
@@ -473,7 +473,7 @@
                 <w:sz w:val="19"/>
                 <w:szCs w:val="19"/>
               </w:rPr>
-              <w:t xml:space="preserve">≈ 22 s</w:t>
+              <w:t xml:space="preserve">20 s (en ligne)</w:t>
             </w:r>
           </w:p>
         </w:tc>
@@ -499,7 +499,7 @@
                 <w:sz w:val="19"/>
                 <w:szCs w:val="19"/>
               </w:rPr>
-              <w:t xml:space="preserve">5 répliques validées, à enregistrer</w:t>
+              <w:t xml:space="preserve">Sans voix pour l’instant ; 5 répliques validées, à enregistrer</w:t>
             </w:r>
           </w:p>
         </w:tc>
@@ -769,7 +769,7 @@
                 <w:sz w:val="19"/>
                 <w:szCs w:val="19"/>
               </w:rPr>
-              <w:t xml:space="preserve">Cadre et voile rouges = manettes ouvertes ; verts = manettes fermées</w:t>
+              <w:t xml:space="preserve">Cadre et voile rouges = manettes ouvertes ; verts = manettes fermées (en fondu)</w:t>
             </w:r>
           </w:p>
         </w:tc>
@@ -931,7 +931,7 @@
                 <w:sz w:val="19"/>
                 <w:szCs w:val="19"/>
               </w:rPr>
-              <w:t xml:space="preserve">5 min 37 s aujourd’hui → environ 6 min 15 s</w:t>
+              <w:t xml:space="preserve">5 min 37 s → 5 min 57 s aujourd’hui ; avec la voix (séquence et étape 1) : environ 6 min 20 s</w:t>
             </w:r>
           </w:p>
         </w:tc>
@@ -958,7 +958,7 @@
                 <w:sz w:val="19"/>
                 <w:szCs w:val="19"/>
               </w:rPr>
-              <w:t xml:space="preserve">+ ≈ 39 s</w:t>
+              <w:t xml:space="preserve">+ 20 s (fait) ; + ≈ 23 s à venir</w:t>
             </w:r>
           </w:p>
         </w:tc>
@@ -1091,7 +1091,7 @@
                 <w:sz w:val="19"/>
                 <w:szCs w:val="19"/>
               </w:rPr>
-              <w:t xml:space="preserve">Scène en anglais (déjà prête)</w:t>
+              <w:t xml:space="preserve">Séquence en anglais (déjà prête : 20 dernières secondes du film anglais)</w:t>
             </w:r>
           </w:p>
         </w:tc>
@@ -1181,7 +1181,7 @@
         <w:rPr>
           <w:rFonts w:ascii="Arial" w:cs="Arial" w:eastAsia="Arial" w:hAnsi="Arial"/>
         </w:rPr>
-        <w:t xml:space="preserve">2. J’aligne le nouvel audio, je découpe les plans du film du mécanisme et je les insère aux deux endroits.</w:t>
+        <w:t xml:space="preserve">2. Je pose la voix sur la séquence déjà en place (arrêts sur image si la voix est plus longue) et le « Pourquoi fermées ? » à l’étape 1.</w:t>
       </w:r>
     </w:p>
     <w:p>
@@ -1192,7 +1192,7 @@
         <w:rPr>
           <w:rFonts w:ascii="Arial" w:cs="Arial" w:eastAsia="Arial" w:hAnsi="Arial"/>
         </w:rPr>
-        <w:t xml:space="preserve">3. Je fais le rendu de la vidéo 1 complète, puis je te la partage pour validation avant la mise en ligne.</w:t>
+        <w:t xml:space="preserve">3. Je refais la vidéo 1 complète, puis je te la partage pour validation avant la mise en ligne.</w:t>
       </w:r>
     </w:p>
     <w:p>
@@ -1369,7 +1369,7 @@
           <w:bCs/>
           <w:color w:val="1F4E79"/>
         </w:rPr>
-        <w:t xml:space="preserve">🎬 NOUVELLE SÉQUENCE — scène « Manettes ouvertes ou fermées ? » : </w:t>
+        <w:t xml:space="preserve">🎬 NOUVELLE SÉQUENCE (déjà dans la vidéo, 20 s, sans voix pour l’instant) : </w:t>
       </w:r>
       <w:r>
         <w:rPr>
@@ -1377,7 +1377,7 @@
           <w:i/>
           <w:iCs/>
         </w:rPr>
-        <w:t xml:space="preserve">mécanisme en coupe, ressorts soulignés. Manettes ouvertes (écran rouge, carte « le cadenas n’y change rien ») sous les répliques 1 et 2, </w:t>
+        <w:t xml:space="preserve">20 dernières secondes du film du mécanisme. 0–5 s : vue 360°, boîtier complet (« cache tout le mécanisme ») ; 5–6,5 s : glissé vers le mécanisme en coupe ; 6,6–12 s : manettes ouvertes, écran rouge, carte « le cadenas n’y change rien » ; </w:t>
       </w:r>
       <w:r>
         <w:rPr>
@@ -1386,7 +1386,7 @@
           <w:iCs/>
           <w:color w:val="595959"/>
         </w:rPr>
-        <w:t xml:space="preserve">manettes fermées (écran vert) sous la réplique 3, carte « Avant de cadenasser : manettes fermées » sous les répliques 4 et 5. Scène de 11 s, ralentie et arrêtée sur image pour suivre la voix (≈ 22 s).</w:t>
+        <w:t xml:space="preserve">12–16,4 s : manettes fermées, écran vert ; 16,4–20 s : « Avant de cadenasser : manettes fermées ». Fondus de 0,5 s à l’entrée et à la sortie. Les répliques ci-dessous sont placées sur ces images ; à l’enregistrement (≈ 27 s de voix), j’allonge la séquence par arrêts sur image.</w:t>
       </w:r>
     </w:p>
     <w:p>
@@ -1405,7 +1405,7 @@
           <w:bCs/>
           <w:color w:val="595959"/>
         </w:rPr>
-        <w:t xml:space="preserve">[nouveau]  </w:t>
+        <w:t xml:space="preserve">[0:18]  </w:t>
       </w:r>
       <w:r>
         <w:rPr>
@@ -1443,7 +1443,7 @@
           <w:bCs/>
           <w:color w:val="595959"/>
         </w:rPr>
-        <w:t xml:space="preserve">[nouveau]  </w:t>
+        <w:t xml:space="preserve">[0:24]  </w:t>
       </w:r>
       <w:r>
         <w:rPr>
@@ -1481,7 +1481,7 @@
           <w:bCs/>
           <w:color w:val="595959"/>
         </w:rPr>
-        <w:t xml:space="preserve">[nouveau]  </w:t>
+        <w:t xml:space="preserve">[0:29]  </w:t>
       </w:r>
       <w:r>
         <w:rPr>
@@ -1519,7 +1519,7 @@
           <w:bCs/>
           <w:color w:val="595959"/>
         </w:rPr>
-        <w:t xml:space="preserve">[nouveau]  </w:t>
+        <w:t xml:space="preserve">[0:34]  </w:t>
       </w:r>
       <w:r>
         <w:rPr>
@@ -1557,7 +1557,7 @@
           <w:bCs/>
           <w:color w:val="595959"/>
         </w:rPr>
-        <w:t xml:space="preserve">[nouveau]  </w:t>
+        <w:t xml:space="preserve">[0:35]  </w:t>
       </w:r>
       <w:r>
         <w:rPr>
@@ -1640,7 +1640,7 @@
           <w:bCs/>
           <w:color w:val="595959"/>
         </w:rPr>
-        <w:t xml:space="preserve">[0:18]  </w:t>
+        <w:t xml:space="preserve">[0:38]  </w:t>
       </w:r>
       <w:r>
         <w:rPr>
@@ -1690,7 +1690,7 @@
           <w:bCs/>
           <w:color w:val="595959"/>
         </w:rPr>
-        <w:t xml:space="preserve">[0:25]  </w:t>
+        <w:t xml:space="preserve">[0:44]  </w:t>
       </w:r>
       <w:r>
         <w:rPr>
@@ -1724,7 +1724,7 @@
           <w:bCs/>
           <w:color w:val="595959"/>
         </w:rPr>
-        <w:t xml:space="preserve">[0:41]  </w:t>
+        <w:t xml:space="preserve">[1:00]  </w:t>
       </w:r>
       <w:r>
         <w:rPr>
@@ -1758,7 +1758,7 @@
           <w:bCs/>
           <w:color w:val="595959"/>
         </w:rPr>
-        <w:t xml:space="preserve">[0:50]  </w:t>
+        <w:t xml:space="preserve">[1:09]  </w:t>
       </w:r>
       <w:r>
         <w:rPr>
@@ -1792,7 +1792,7 @@
           <w:bCs/>
           <w:color w:val="595959"/>
         </w:rPr>
-        <w:t xml:space="preserve">[0:56]  </w:t>
+        <w:t xml:space="preserve">[1:15]  </w:t>
       </w:r>
       <w:r>
         <w:rPr>
@@ -1826,7 +1826,7 @@
           <w:bCs/>
           <w:color w:val="595959"/>
         </w:rPr>
-        <w:t xml:space="preserve">[1:26]  </w:t>
+        <w:t xml:space="preserve">[1:45]  </w:t>
       </w:r>
       <w:r>
         <w:rPr>
@@ -1860,7 +1860,7 @@
           <w:bCs/>
           <w:color w:val="595959"/>
         </w:rPr>
-        <w:t xml:space="preserve">[1:35]  </w:t>
+        <w:t xml:space="preserve">[1:54]  </w:t>
       </w:r>
       <w:r>
         <w:rPr>
@@ -1894,7 +1894,7 @@
           <w:bCs/>
           <w:color w:val="595959"/>
         </w:rPr>
-        <w:t xml:space="preserve">[1:47]  </w:t>
+        <w:t xml:space="preserve">[2:07]  </w:t>
       </w:r>
       <w:r>
         <w:rPr>
@@ -1928,7 +1928,7 @@
           <w:bCs/>
           <w:color w:val="595959"/>
         </w:rPr>
-        <w:t xml:space="preserve">[2:01]  </w:t>
+        <w:t xml:space="preserve">[2:20]  </w:t>
       </w:r>
       <w:r>
         <w:rPr>
@@ -1962,7 +1962,7 @@
           <w:bCs/>
           <w:color w:val="595959"/>
         </w:rPr>
-        <w:t xml:space="preserve">[2:14]  </w:t>
+        <w:t xml:space="preserve">[2:33]  </w:t>
       </w:r>
       <w:r>
         <w:rPr>
@@ -1996,7 +1996,7 @@
           <w:bCs/>
           <w:color w:val="595959"/>
         </w:rPr>
-        <w:t xml:space="preserve">[2:31]  </w:t>
+        <w:t xml:space="preserve">[2:51]  </w:t>
       </w:r>
       <w:r>
         <w:rPr>
@@ -2030,7 +2030,7 @@
           <w:bCs/>
           <w:color w:val="595959"/>
         </w:rPr>
-        <w:t xml:space="preserve">[2:41]  </w:t>
+        <w:t xml:space="preserve">[3:01]  </w:t>
       </w:r>
       <w:r>
         <w:rPr>
@@ -2064,7 +2064,7 @@
           <w:bCs/>
           <w:color w:val="595959"/>
         </w:rPr>
-        <w:t xml:space="preserve">[2:42]  </w:t>
+        <w:t xml:space="preserve">[3:02]  </w:t>
       </w:r>
       <w:r>
         <w:rPr>
@@ -2098,7 +2098,7 @@
           <w:bCs/>
           <w:color w:val="595959"/>
         </w:rPr>
-        <w:t xml:space="preserve">[3:06]  </w:t>
+        <w:t xml:space="preserve">[3:25]  </w:t>
       </w:r>
       <w:r>
         <w:rPr>
@@ -2132,7 +2132,7 @@
           <w:bCs/>
           <w:color w:val="595959"/>
         </w:rPr>
-        <w:t xml:space="preserve">[3:10]  </w:t>
+        <w:t xml:space="preserve">[3:29]  </w:t>
       </w:r>
       <w:r>
         <w:rPr>
@@ -2166,7 +2166,7 @@
           <w:bCs/>
           <w:color w:val="595959"/>
         </w:rPr>
-        <w:t xml:space="preserve">[3:17]  </w:t>
+        <w:t xml:space="preserve">[3:37]  </w:t>
       </w:r>
       <w:r>
         <w:rPr>
@@ -2200,7 +2200,7 @@
           <w:bCs/>
           <w:color w:val="595959"/>
         </w:rPr>
-        <w:t xml:space="preserve">[3:24]  </w:t>
+        <w:t xml:space="preserve">[3:44]  </w:t>
       </w:r>
       <w:r>
         <w:rPr>
@@ -2234,7 +2234,7 @@
           <w:bCs/>
           <w:color w:val="595959"/>
         </w:rPr>
-        <w:t xml:space="preserve">[3:37]  </w:t>
+        <w:t xml:space="preserve">[3:56]  </w:t>
       </w:r>
       <w:r>
         <w:rPr>
@@ -2268,7 +2268,7 @@
           <w:bCs/>
           <w:color w:val="595959"/>
         </w:rPr>
-        <w:t xml:space="preserve">[3:50]  </w:t>
+        <w:t xml:space="preserve">[4:10]  </w:t>
       </w:r>
       <w:r>
         <w:rPr>
@@ -2302,7 +2302,7 @@
           <w:bCs/>
           <w:color w:val="595959"/>
         </w:rPr>
-        <w:t xml:space="preserve">[3:53]  </w:t>
+        <w:t xml:space="preserve">[4:13]  </w:t>
       </w:r>
       <w:r>
         <w:rPr>
@@ -2336,7 +2336,7 @@
           <w:bCs/>
           <w:color w:val="595959"/>
         </w:rPr>
-        <w:t xml:space="preserve">[4:00]  </w:t>
+        <w:t xml:space="preserve">[4:20]  </w:t>
       </w:r>
       <w:r>
         <w:rPr>
@@ -2370,7 +2370,7 @@
           <w:bCs/>
           <w:color w:val="595959"/>
         </w:rPr>
-        <w:t xml:space="preserve">[4:03]  </w:t>
+        <w:t xml:space="preserve">[4:22]  </w:t>
       </w:r>
       <w:r>
         <w:rPr>
@@ -2404,7 +2404,7 @@
           <w:bCs/>
           <w:color w:val="595959"/>
         </w:rPr>
-        <w:t xml:space="preserve">[4:10]  </w:t>
+        <w:t xml:space="preserve">[4:30]  </w:t>
       </w:r>
       <w:r>
         <w:rPr>
@@ -2438,7 +2438,7 @@
           <w:bCs/>
           <w:color w:val="595959"/>
         </w:rPr>
-        <w:t xml:space="preserve">[4:13]  </w:t>
+        <w:t xml:space="preserve">[4:32]  </w:t>
       </w:r>
       <w:r>
         <w:rPr>
@@ -2472,7 +2472,7 @@
           <w:bCs/>
           <w:color w:val="595959"/>
         </w:rPr>
-        <w:t xml:space="preserve">[4:20]  </w:t>
+        <w:t xml:space="preserve">[4:39]  </w:t>
       </w:r>
       <w:r>
         <w:rPr>
@@ -2506,7 +2506,7 @@
           <w:bCs/>
           <w:color w:val="595959"/>
         </w:rPr>
-        <w:t xml:space="preserve">[4:24]  </w:t>
+        <w:t xml:space="preserve">[4:44]  </w:t>
       </w:r>
       <w:r>
         <w:rPr>
@@ -2540,7 +2540,7 @@
           <w:bCs/>
           <w:color w:val="595959"/>
         </w:rPr>
-        <w:t xml:space="preserve">[4:31]  </w:t>
+        <w:t xml:space="preserve">[4:51]  </w:t>
       </w:r>
       <w:r>
         <w:rPr>
@@ -2574,7 +2574,7 @@
           <w:bCs/>
           <w:color w:val="595959"/>
         </w:rPr>
-        <w:t xml:space="preserve">[4:35]  </w:t>
+        <w:t xml:space="preserve">[4:55]  </w:t>
       </w:r>
       <w:r>
         <w:rPr>
@@ -2608,7 +2608,7 @@
           <w:bCs/>
           <w:color w:val="595959"/>
         </w:rPr>
-        <w:t xml:space="preserve">[4:48]  </w:t>
+        <w:t xml:space="preserve">[5:07]  </w:t>
       </w:r>
       <w:r>
         <w:rPr>

</xml_diff>

<commit_message>
Script FR : indications de ton ElevenLabs (mêmes balises que le script anglais), aussi dans les blocs à coller
Co-Authored-By: Claude Opus 5.5 <noreply@anthropic.com>
Claude-Session: https://claude.ai/code/session_016YnqtNNUyZYY3JuA5BfKCG
</commit_message>
<xml_diff>
--- a/video/Script_PRO-OP-DD-005_mecanisme.docx
+++ b/video/Script_PRO-OP-DD-005_mecanisme.docx
@@ -96,6 +96,29 @@
           <w:rFonts w:ascii="Arial" w:cs="Arial" w:eastAsia="Arial" w:hAnsi="Arial"/>
         </w:rPr>
         <w:t xml:space="preserve">texte noir : enregistré, inchangé</w:t>
+      </w:r>
+      <w:r>
+        <w:rPr>
+          <w:rFonts w:ascii="Arial" w:cs="Arial" w:eastAsia="Arial" w:hAnsi="Arial"/>
+        </w:rPr>
+        <w:t xml:space="preserve">   ·   </w:t>
+      </w:r>
+      <w:r>
+        <w:rPr>
+          <w:rFonts w:ascii="Arial" w:cs="Arial" w:eastAsia="Arial" w:hAnsi="Arial"/>
+          <w:i/>
+          <w:iCs/>
+          <w:color w:val="7B3FA0"/>
+          <w:sz w:val="19"/>
+          <w:szCs w:val="19"/>
+        </w:rPr>
+        <w:t xml:space="preserve">[ton]</w:t>
+      </w:r>
+      <w:r>
+        <w:rPr>
+          <w:rFonts w:ascii="Arial" w:cs="Arial" w:eastAsia="Arial" w:hAnsi="Arial"/>
+        </w:rPr>
+        <w:t xml:space="preserve"> : indication de ton ElevenLabs, non dite</w:t>
       </w:r>
       <w:r>
         <w:rPr>
@@ -1896,8 +1919,20 @@
       <w:r>
         <w:rPr>
           <w:rFonts w:ascii="Arial" w:cs="Arial" w:eastAsia="Arial" w:hAnsi="Arial"/>
-        </w:rPr>
-        <w:t xml:space="preserve">À matin, on parle du démontage du cône d'un mandrin.</w:t>
+          <w:i/>
+          <w:iCs/>
+          <w:strike w:val="false"/>
+          <w:color w:val="7B3FA0"/>
+          <w:sz w:val="19"/>
+          <w:szCs w:val="19"/>
+        </w:rPr>
+        <w:t xml:space="preserve">[calm]</w:t>
+      </w:r>
+      <w:r>
+        <w:rPr>
+          <w:rFonts w:ascii="Arial" w:cs="Arial" w:eastAsia="Arial" w:hAnsi="Arial"/>
+        </w:rPr>
+        <w:t xml:space="preserve"> À matin, on parle du démontage du cône d'un mandrin.</w:t>
       </w:r>
     </w:p>
     <w:p>
@@ -1930,8 +1965,20 @@
       <w:r>
         <w:rPr>
           <w:rFonts w:ascii="Arial" w:cs="Arial" w:eastAsia="Arial" w:hAnsi="Arial"/>
-        </w:rPr>
-        <w:t xml:space="preserve">Avec les dix-huit ressorts comprimés en arrière, hein ?</w:t>
+          <w:i/>
+          <w:iCs/>
+          <w:strike w:val="false"/>
+          <w:color w:val="7B3FA0"/>
+          <w:sz w:val="19"/>
+          <w:szCs w:val="19"/>
+        </w:rPr>
+        <w:t xml:space="preserve">[curious]</w:t>
+      </w:r>
+      <w:r>
+        <w:rPr>
+          <w:rFonts w:ascii="Arial" w:cs="Arial" w:eastAsia="Arial" w:hAnsi="Arial"/>
+        </w:rPr>
+        <w:t xml:space="preserve"> Avec les dix-huit ressorts comprimés en arrière, hein ?</w:t>
       </w:r>
     </w:p>
     <w:p>
@@ -1964,8 +2011,20 @@
       <w:r>
         <w:rPr>
           <w:rFonts w:ascii="Arial" w:cs="Arial" w:eastAsia="Arial" w:hAnsi="Arial"/>
-        </w:rPr>
-        <w:t xml:space="preserve">Exactement. Tant que le cône est boulonné, c'est de l'énergie emmagasinée.</w:t>
+          <w:i/>
+          <w:iCs/>
+          <w:strike w:val="false"/>
+          <w:color w:val="7B3FA0"/>
+          <w:sz w:val="19"/>
+          <w:szCs w:val="19"/>
+        </w:rPr>
+        <w:t xml:space="preserve">[serious]</w:t>
+      </w:r>
+      <w:r>
+        <w:rPr>
+          <w:rFonts w:ascii="Arial" w:cs="Arial" w:eastAsia="Arial" w:hAnsi="Arial"/>
+        </w:rPr>
+        <w:t xml:space="preserve"> Exactement. Tant que le cône est boulonné, c'est de l'énergie emmagasinée.</w:t>
       </w:r>
     </w:p>
     <w:p>
@@ -1998,8 +2057,20 @@
       <w:r>
         <w:rPr>
           <w:rFonts w:ascii="Arial" w:cs="Arial" w:eastAsia="Arial" w:hAnsi="Arial"/>
-        </w:rPr>
-        <w:t xml:space="preserve">Correct. On regarde ça étape par étape.</w:t>
+          <w:i/>
+          <w:iCs/>
+          <w:strike w:val="false"/>
+          <w:color w:val="7B3FA0"/>
+          <w:sz w:val="19"/>
+          <w:szCs w:val="19"/>
+        </w:rPr>
+        <w:t xml:space="preserve">[calm]</w:t>
+      </w:r>
+      <w:r>
+        <w:rPr>
+          <w:rFonts w:ascii="Arial" w:cs="Arial" w:eastAsia="Arial" w:hAnsi="Arial"/>
+        </w:rPr>
+        <w:t xml:space="preserve"> Correct. On regarde ça étape par étape.</w:t>
       </w:r>
     </w:p>
     <w:p>
@@ -2077,12 +2148,24 @@
       <w:r>
         <w:rPr>
           <w:rFonts w:ascii="Arial" w:cs="Arial" w:eastAsia="Arial" w:hAnsi="Arial"/>
+          <w:i/>
+          <w:iCs/>
+          <w:strike w:val="false"/>
+          <w:color w:val="7B3FA0"/>
+          <w:sz w:val="19"/>
+          <w:szCs w:val="19"/>
+        </w:rPr>
+        <w:t xml:space="preserve">[calm]</w:t>
+      </w:r>
+      <w:r>
+        <w:rPr>
+          <w:rFonts w:ascii="Arial" w:cs="Arial" w:eastAsia="Arial" w:hAnsi="Arial"/>
           <w:b/>
           <w:bCs/>
           <w:color w:val="1E7B34"/>
           <w:u w:val="single" w:color="1E7B34"/>
         </w:rPr>
-        <w:t xml:space="preserve">Avant de commencer, on regarde ce qu'il y a dans le mandrin.</w:t>
+        <w:t xml:space="preserve"> Avant de commencer, on regarde ce qu'il y a dans le mandrin.</w:t>
       </w:r>
     </w:p>
     <w:p>
@@ -2115,12 +2198,24 @@
       <w:r>
         <w:rPr>
           <w:rFonts w:ascii="Arial" w:cs="Arial" w:eastAsia="Arial" w:hAnsi="Arial"/>
+          <w:i/>
+          <w:iCs/>
+          <w:strike w:val="false"/>
+          <w:color w:val="7B3FA0"/>
+          <w:sz w:val="19"/>
+          <w:szCs w:val="19"/>
+        </w:rPr>
+        <w:t xml:space="preserve">[serious]</w:t>
+      </w:r>
+      <w:r>
+        <w:rPr>
+          <w:rFonts w:ascii="Arial" w:cs="Arial" w:eastAsia="Arial" w:hAnsi="Arial"/>
           <w:b/>
           <w:bCs/>
           <w:color w:val="1E7B34"/>
           <w:u w:val="single" w:color="1E7B34"/>
         </w:rPr>
-        <w:t xml:space="preserve">Manettes ouvertes : l'huile pousse le piston, qui tire le cône vers l'arrière. Les ressorts s'écrasent, pis les mâchoires s'ouvrent.</w:t>
+        <w:t xml:space="preserve"> Manettes ouvertes : l'huile pousse le piston, qui tire le cône vers l'arrière. Les ressorts s'écrasent, pis les mâchoires s'ouvrent.</w:t>
       </w:r>
     </w:p>
     <w:p>
@@ -2153,12 +2248,24 @@
       <w:r>
         <w:rPr>
           <w:rFonts w:ascii="Arial" w:cs="Arial" w:eastAsia="Arial" w:hAnsi="Arial"/>
+          <w:i/>
+          <w:iCs/>
+          <w:strike w:val="false"/>
+          <w:color w:val="7B3FA0"/>
+          <w:sz w:val="19"/>
+          <w:szCs w:val="19"/>
+        </w:rPr>
+        <w:t xml:space="preserve">[calm]</w:t>
+      </w:r>
+      <w:r>
+        <w:rPr>
+          <w:rFonts w:ascii="Arial" w:cs="Arial" w:eastAsia="Arial" w:hAnsi="Arial"/>
           <w:b/>
           <w:bCs/>
           <w:color w:val="1E7B34"/>
           <w:u w:val="single" w:color="1E7B34"/>
         </w:rPr>
-        <w:t xml:space="preserve">Manettes fermées : la pression tombe. Les ressorts poussent le cône vers l'avant, pis son coin referme les mâchoires sur la tige.</w:t>
+        <w:t xml:space="preserve"> Manettes fermées : la pression tombe. Les ressorts poussent le cône vers l'avant, pis son coin referme les mâchoires sur la tige.</w:t>
       </w:r>
     </w:p>
     <w:p>
@@ -2191,12 +2298,24 @@
       <w:r>
         <w:rPr>
           <w:rFonts w:ascii="Arial" w:cs="Arial" w:eastAsia="Arial" w:hAnsi="Arial"/>
+          <w:i/>
+          <w:iCs/>
+          <w:strike w:val="false"/>
+          <w:color w:val="7B3FA0"/>
+          <w:sz w:val="19"/>
+          <w:szCs w:val="19"/>
+        </w:rPr>
+        <w:t xml:space="preserve">[curious]</w:t>
+      </w:r>
+      <w:r>
+        <w:rPr>
+          <w:rFonts w:ascii="Arial" w:cs="Arial" w:eastAsia="Arial" w:hAnsi="Arial"/>
           <w:b/>
           <w:bCs/>
           <w:color w:val="1E7B34"/>
           <w:u w:val="single" w:color="1E7B34"/>
         </w:rPr>
-        <w:t xml:space="preserve">Fait que les ressorts poussent tout le temps ?</w:t>
+        <w:t xml:space="preserve"> Fait que les ressorts poussent tout le temps ?</w:t>
       </w:r>
     </w:p>
     <w:p>
@@ -2229,12 +2348,24 @@
       <w:r>
         <w:rPr>
           <w:rFonts w:ascii="Arial" w:cs="Arial" w:eastAsia="Arial" w:hAnsi="Arial"/>
+          <w:i/>
+          <w:iCs/>
+          <w:strike w:val="false"/>
+          <w:color w:val="7B3FA0"/>
+          <w:sz w:val="19"/>
+          <w:szCs w:val="19"/>
+        </w:rPr>
+        <w:t xml:space="preserve">[serious]</w:t>
+      </w:r>
+      <w:r>
+        <w:rPr>
+          <w:rFonts w:ascii="Arial" w:cs="Arial" w:eastAsia="Arial" w:hAnsi="Arial"/>
           <w:b/>
           <w:bCs/>
           <w:color w:val="1E7B34"/>
           <w:u w:val="single" w:color="1E7B34"/>
         </w:rPr>
-        <w:t xml:space="preserve">Tout le temps. Pis de l'extérieur, on voit rien : tout est caché dans le boîtier.</w:t>
+        <w:t xml:space="preserve"> Tout le temps. Pis de l'extérieur, on voit rien : tout est caché dans le boîtier.</w:t>
       </w:r>
     </w:p>
     <w:p>
@@ -2312,14 +2443,38 @@
       <w:r>
         <w:rPr>
           <w:rFonts w:ascii="Arial" w:cs="Arial" w:eastAsia="Arial" w:hAnsi="Arial"/>
-        </w:rPr>
-        <w:t xml:space="preserve">Étape un : les manettes Clam et Chuck en position fermée.</w:t>
+          <w:i/>
+          <w:iCs/>
+          <w:strike w:val="false"/>
+          <w:color w:val="7B3FA0"/>
+          <w:sz w:val="19"/>
+          <w:szCs w:val="19"/>
+        </w:rPr>
+        <w:t xml:space="preserve">[calm]</w:t>
+      </w:r>
+      <w:r>
+        <w:rPr>
+          <w:rFonts w:ascii="Arial" w:cs="Arial" w:eastAsia="Arial" w:hAnsi="Arial"/>
+        </w:rPr>
+        <w:t xml:space="preserve"> Étape un : les manettes Clam et Chuck en position fermée.</w:t>
       </w:r>
       <w:r>
         <w:rPr>
           <w:rFonts w:ascii="Arial" w:cs="Arial" w:eastAsia="Arial" w:hAnsi="Arial"/>
         </w:rPr>
         <w:t xml:space="preserve"> </w:t>
+      </w:r>
+      <w:r>
+        <w:rPr>
+          <w:rFonts w:ascii="Arial" w:cs="Arial" w:eastAsia="Arial" w:hAnsi="Arial"/>
+          <w:i/>
+          <w:iCs/>
+          <w:strike w:val="false"/>
+          <w:color w:val="7B3FA0"/>
+          <w:sz w:val="19"/>
+          <w:szCs w:val="19"/>
+        </w:rPr>
+        <w:t xml:space="preserve">[calm]</w:t>
       </w:r>
       <w:r>
         <w:rPr>
@@ -2329,7 +2484,51 @@
           <w:color w:val="B45F06"/>
           <w:shd w:fill="FFF2CC" w:color="auto" w:val="clear"/>
         </w:rPr>
-        <w:t xml:space="preserve">Pourquoi fermées ? En position ouverte, l'hydraulique pousse le vérin, pis les ressorts sont écrasés au maximum. Si on cadenasse comme ça, le cadenas n'y change rien : toute cette énergie-là reste prise dans le mandrin. Fermées, les ressorts sont étirés au maximum : c'est là qu'il en reste le moins.</w:t>
+        <w:t xml:space="preserve"> Pourquoi fermées ? </w:t>
+      </w:r>
+      <w:r>
+        <w:rPr>
+          <w:rFonts w:ascii="Arial" w:cs="Arial" w:eastAsia="Arial" w:hAnsi="Arial"/>
+          <w:i/>
+          <w:iCs/>
+          <w:strike w:val="false"/>
+          <w:color w:val="7B3FA0"/>
+          <w:sz w:val="19"/>
+          <w:szCs w:val="19"/>
+        </w:rPr>
+        <w:t xml:space="preserve">[serious]</w:t>
+      </w:r>
+      <w:r>
+        <w:rPr>
+          <w:rFonts w:ascii="Arial" w:cs="Arial" w:eastAsia="Arial" w:hAnsi="Arial"/>
+          <w:b/>
+          <w:bCs/>
+          <w:color w:val="B45F06"/>
+          <w:shd w:fill="FFF2CC" w:color="auto" w:val="clear"/>
+        </w:rPr>
+        <w:t xml:space="preserve"> En position ouverte, l'hydraulique pousse le vérin, pis les ressorts sont écrasés au maximum. Si on cadenasse comme ça, le cadenas n'y change rien : toute cette énergie-là reste prise dans le mandrin. </w:t>
+      </w:r>
+      <w:r>
+        <w:rPr>
+          <w:rFonts w:ascii="Arial" w:cs="Arial" w:eastAsia="Arial" w:hAnsi="Arial"/>
+          <w:i/>
+          <w:iCs/>
+          <w:strike w:val="false"/>
+          <w:color w:val="7B3FA0"/>
+          <w:sz w:val="19"/>
+          <w:szCs w:val="19"/>
+        </w:rPr>
+        <w:t xml:space="preserve">[calm]</w:t>
+      </w:r>
+      <w:r>
+        <w:rPr>
+          <w:rFonts w:ascii="Arial" w:cs="Arial" w:eastAsia="Arial" w:hAnsi="Arial"/>
+          <w:b/>
+          <w:bCs/>
+          <w:color w:val="B45F06"/>
+          <w:shd w:fill="FFF2CC" w:color="auto" w:val="clear"/>
+        </w:rPr>
+        <w:t xml:space="preserve"> Fermées, les ressorts sont étirés au maximum : c'est là qu'il en reste le moins.</w:t>
       </w:r>
     </w:p>
     <w:p>
@@ -2407,8 +2606,56 @@
       <w:r>
         <w:rPr>
           <w:rFonts w:ascii="Arial" w:cs="Arial" w:eastAsia="Arial" w:hAnsi="Arial"/>
-        </w:rPr>
-        <w:t xml:space="preserve">Regardez la coupe : l'hydraulique est coupé, mais les ressorts verts sont encore comprimés. Fermer les manettes ne libère pas leur énergie. C'est ce qu'on appelle de l'énergie résiduelle : elle reste emmagasinée dans l'équipement, même quand la source est arrêtée.</w:t>
+          <w:i/>
+          <w:iCs/>
+          <w:strike w:val="false"/>
+          <w:color w:val="7B3FA0"/>
+          <w:sz w:val="19"/>
+          <w:szCs w:val="19"/>
+        </w:rPr>
+        <w:t xml:space="preserve">[calm]</w:t>
+      </w:r>
+      <w:r>
+        <w:rPr>
+          <w:rFonts w:ascii="Arial" w:cs="Arial" w:eastAsia="Arial" w:hAnsi="Arial"/>
+        </w:rPr>
+        <w:t xml:space="preserve"> Regardez la coupe : l'hydraulique est coupé, </w:t>
+      </w:r>
+      <w:r>
+        <w:rPr>
+          <w:rFonts w:ascii="Arial" w:cs="Arial" w:eastAsia="Arial" w:hAnsi="Arial"/>
+          <w:i/>
+          <w:iCs/>
+          <w:strike w:val="false"/>
+          <w:color w:val="7B3FA0"/>
+          <w:sz w:val="19"/>
+          <w:szCs w:val="19"/>
+        </w:rPr>
+        <w:t xml:space="preserve">[serious]</w:t>
+      </w:r>
+      <w:r>
+        <w:rPr>
+          <w:rFonts w:ascii="Arial" w:cs="Arial" w:eastAsia="Arial" w:hAnsi="Arial"/>
+        </w:rPr>
+        <w:t xml:space="preserve"> mais les ressorts verts sont encore comprimés. Fermer les manettes ne libère pas leur énergie. </w:t>
+      </w:r>
+      <w:r>
+        <w:rPr>
+          <w:rFonts w:ascii="Arial" w:cs="Arial" w:eastAsia="Arial" w:hAnsi="Arial"/>
+          <w:i/>
+          <w:iCs/>
+          <w:strike w:val="false"/>
+          <w:color w:val="7B3FA0"/>
+          <w:sz w:val="19"/>
+          <w:szCs w:val="19"/>
+        </w:rPr>
+        <w:t xml:space="preserve">[calm]</w:t>
+      </w:r>
+      <w:r>
+        <w:rPr>
+          <w:rFonts w:ascii="Arial" w:cs="Arial" w:eastAsia="Arial" w:hAnsi="Arial"/>
+        </w:rPr>
+        <w:t xml:space="preserve"> C'est ce qu'on appelle de l'énergie résiduelle : elle reste emmagasinée dans l'équipement, même quand la source est arrêtée.</w:t>
       </w:r>
     </w:p>
     <w:p>
@@ -2441,8 +2688,20 @@
       <w:r>
         <w:rPr>
           <w:rFonts w:ascii="Arial" w:cs="Arial" w:eastAsia="Arial" w:hAnsi="Arial"/>
-        </w:rPr>
-        <w:t xml:space="preserve">Étape deux : on vérifie que les mâchoires, les jaws, sont fermées.</w:t>
+          <w:i/>
+          <w:iCs/>
+          <w:strike w:val="false"/>
+          <w:color w:val="7B3FA0"/>
+          <w:sz w:val="19"/>
+          <w:szCs w:val="19"/>
+        </w:rPr>
+        <w:t xml:space="preserve">[calm]</w:t>
+      </w:r>
+      <w:r>
+        <w:rPr>
+          <w:rFonts w:ascii="Arial" w:cs="Arial" w:eastAsia="Arial" w:hAnsi="Arial"/>
+        </w:rPr>
+        <w:t xml:space="preserve"> Étape deux : on vérifie que les mâchoires, les jaws, sont fermées.</w:t>
       </w:r>
     </w:p>
     <w:p>
@@ -2475,8 +2734,38 @@
       <w:r>
         <w:rPr>
           <w:rFonts w:ascii="Arial" w:cs="Arial" w:eastAsia="Arial" w:hAnsi="Arial"/>
-        </w:rPr>
-        <w:t xml:space="preserve">Étape trois : on cadenasse la foreuse. Chacun pose son cadenas, pis on vérifie que la foreuse peut pas repartir. Le cadenas empêche de repartir l'hydraulique, mais les ressorts, eux, poussent encore.</w:t>
+          <w:i/>
+          <w:iCs/>
+          <w:strike w:val="false"/>
+          <w:color w:val="7B3FA0"/>
+          <w:sz w:val="19"/>
+          <w:szCs w:val="19"/>
+        </w:rPr>
+        <w:t xml:space="preserve">[calm]</w:t>
+      </w:r>
+      <w:r>
+        <w:rPr>
+          <w:rFonts w:ascii="Arial" w:cs="Arial" w:eastAsia="Arial" w:hAnsi="Arial"/>
+        </w:rPr>
+        <w:t xml:space="preserve"> Étape trois : on cadenasse la foreuse. Chacun pose son cadenas, pis on vérifie que la foreuse peut pas repartir. </w:t>
+      </w:r>
+      <w:r>
+        <w:rPr>
+          <w:rFonts w:ascii="Arial" w:cs="Arial" w:eastAsia="Arial" w:hAnsi="Arial"/>
+          <w:i/>
+          <w:iCs/>
+          <w:strike w:val="false"/>
+          <w:color w:val="7B3FA0"/>
+          <w:sz w:val="19"/>
+          <w:szCs w:val="19"/>
+        </w:rPr>
+        <w:t xml:space="preserve">[serious]</w:t>
+      </w:r>
+      <w:r>
+        <w:rPr>
+          <w:rFonts w:ascii="Arial" w:cs="Arial" w:eastAsia="Arial" w:hAnsi="Arial"/>
+        </w:rPr>
+        <w:t xml:space="preserve"> Le cadenas empêche de repartir l'hydraulique, mais les ressorts, eux, poussent encore.</w:t>
       </w:r>
       <w:r>
         <w:rPr>
@@ -2523,8 +2812,20 @@
       <w:r>
         <w:rPr>
           <w:rFonts w:ascii="Arial" w:cs="Arial" w:eastAsia="Arial" w:hAnsi="Arial"/>
-        </w:rPr>
-        <w:t xml:space="preserve">Étape quatre : les trois boulons de trois quarts du couvert des mâchoires, avec la clé d'un pouce et un huitième.</w:t>
+          <w:i/>
+          <w:iCs/>
+          <w:strike w:val="false"/>
+          <w:color w:val="7B3FA0"/>
+          <w:sz w:val="19"/>
+          <w:szCs w:val="19"/>
+        </w:rPr>
+        <w:t xml:space="preserve">[calm]</w:t>
+      </w:r>
+      <w:r>
+        <w:rPr>
+          <w:rFonts w:ascii="Arial" w:cs="Arial" w:eastAsia="Arial" w:hAnsi="Arial"/>
+        </w:rPr>
+        <w:t xml:space="preserve"> Étape quatre : les trois boulons de trois quarts du couvert des mâchoires, avec la clé d'un pouce et un huitième.</w:t>
       </w:r>
     </w:p>
     <w:p>
@@ -2557,8 +2858,20 @@
       <w:r>
         <w:rPr>
           <w:rFonts w:ascii="Arial" w:cs="Arial" w:eastAsia="Arial" w:hAnsi="Arial"/>
-        </w:rPr>
-        <w:t xml:space="preserve">Étape cinq : les neuf boulons d'un demi-pouce du couvercle, avec la clé de trois quarts.</w:t>
+          <w:i/>
+          <w:iCs/>
+          <w:strike w:val="false"/>
+          <w:color w:val="7B3FA0"/>
+          <w:sz w:val="19"/>
+          <w:szCs w:val="19"/>
+        </w:rPr>
+        <w:t xml:space="preserve">[calm]</w:t>
+      </w:r>
+      <w:r>
+        <w:rPr>
+          <w:rFonts w:ascii="Arial" w:cs="Arial" w:eastAsia="Arial" w:hAnsi="Arial"/>
+        </w:rPr>
+        <w:t xml:space="preserve"> Étape cinq : les neuf boulons d'un demi-pouce du couvercle, avec la clé de trois quarts.</w:t>
       </w:r>
     </w:p>
     <w:p>
@@ -2591,8 +2904,38 @@
       <w:r>
         <w:rPr>
           <w:rFonts w:ascii="Arial" w:cs="Arial" w:eastAsia="Arial" w:hAnsi="Arial"/>
-        </w:rPr>
-        <w:t xml:space="preserve">Étape six, c'est la clé de toute la job. Il est important de desserrer les boulons longs un à la fois, de retirer l'espaceur, qu'on appelle le bushing, pis de resserrer complètement le boulon sans bushing.</w:t>
+          <w:i/>
+          <w:iCs/>
+          <w:strike w:val="false"/>
+          <w:color w:val="7B3FA0"/>
+          <w:sz w:val="19"/>
+          <w:szCs w:val="19"/>
+        </w:rPr>
+        <w:t xml:space="preserve">[confident]</w:t>
+      </w:r>
+      <w:r>
+        <w:rPr>
+          <w:rFonts w:ascii="Arial" w:cs="Arial" w:eastAsia="Arial" w:hAnsi="Arial"/>
+        </w:rPr>
+        <w:t xml:space="preserve"> Étape six, c'est la clé de toute la job. </w:t>
+      </w:r>
+      <w:r>
+        <w:rPr>
+          <w:rFonts w:ascii="Arial" w:cs="Arial" w:eastAsia="Arial" w:hAnsi="Arial"/>
+          <w:i/>
+          <w:iCs/>
+          <w:strike w:val="false"/>
+          <w:color w:val="7B3FA0"/>
+          <w:sz w:val="19"/>
+          <w:szCs w:val="19"/>
+        </w:rPr>
+        <w:t xml:space="preserve">[calm]</w:t>
+      </w:r>
+      <w:r>
+        <w:rPr>
+          <w:rFonts w:ascii="Arial" w:cs="Arial" w:eastAsia="Arial" w:hAnsi="Arial"/>
+        </w:rPr>
+        <w:t xml:space="preserve"> Il est important de desserrer les boulons longs un à la fois, de retirer l'espaceur, qu'on appelle le bushing, pis de resserrer complètement le boulon sans bushing.</w:t>
       </w:r>
     </w:p>
     <w:p>
@@ -2625,8 +2968,38 @@
       <w:r>
         <w:rPr>
           <w:rFonts w:ascii="Arial" w:cs="Arial" w:eastAsia="Arial" w:hAnsi="Arial"/>
-        </w:rPr>
-        <w:t xml:space="preserve">Ça nous permet d'avoir l'espace requis pour desserrer les six autres boulons, tout en enlevant la tension des ressorts. Pis on garde une sécurité supplémentaire avec les trois boulons longs toujours en place.</w:t>
+          <w:i/>
+          <w:iCs/>
+          <w:strike w:val="false"/>
+          <w:color w:val="7B3FA0"/>
+          <w:sz w:val="19"/>
+          <w:szCs w:val="19"/>
+        </w:rPr>
+        <w:t xml:space="preserve">[calm]</w:t>
+      </w:r>
+      <w:r>
+        <w:rPr>
+          <w:rFonts w:ascii="Arial" w:cs="Arial" w:eastAsia="Arial" w:hAnsi="Arial"/>
+        </w:rPr>
+        <w:t xml:space="preserve"> Ça nous permet d'avoir l'espace requis pour desserrer les six autres boulons, tout en enlevant la tension des ressorts. </w:t>
+      </w:r>
+      <w:r>
+        <w:rPr>
+          <w:rFonts w:ascii="Arial" w:cs="Arial" w:eastAsia="Arial" w:hAnsi="Arial"/>
+          <w:i/>
+          <w:iCs/>
+          <w:strike w:val="false"/>
+          <w:color w:val="7B3FA0"/>
+          <w:sz w:val="19"/>
+          <w:szCs w:val="19"/>
+        </w:rPr>
+        <w:t xml:space="preserve">[reassuring]</w:t>
+      </w:r>
+      <w:r>
+        <w:rPr>
+          <w:rFonts w:ascii="Arial" w:cs="Arial" w:eastAsia="Arial" w:hAnsi="Arial"/>
+        </w:rPr>
+        <w:t xml:space="preserve"> Pis on garde une sécurité supplémentaire avec les trois boulons longs toujours en place.</w:t>
       </w:r>
     </w:p>
     <w:p>
@@ -2659,8 +3032,20 @@
       <w:r>
         <w:rPr>
           <w:rFonts w:ascii="Arial" w:cs="Arial" w:eastAsia="Arial" w:hAnsi="Arial"/>
-        </w:rPr>
-        <w:t xml:space="preserve">Étape sept : les six boulons d'un demi-pouce par six pouces et demi. Un tour à la fois, dans l'ordre, de un à six. Regardez le compteur en haut à droite, pis la fenêtre en bas : à chaque tour, les ressorts s'allongent un peu.</w:t>
+          <w:i/>
+          <w:iCs/>
+          <w:strike w:val="false"/>
+          <w:color w:val="7B3FA0"/>
+          <w:sz w:val="19"/>
+          <w:szCs w:val="19"/>
+        </w:rPr>
+        <w:t xml:space="preserve">[calm]</w:t>
+      </w:r>
+      <w:r>
+        <w:rPr>
+          <w:rFonts w:ascii="Arial" w:cs="Arial" w:eastAsia="Arial" w:hAnsi="Arial"/>
+        </w:rPr>
+        <w:t xml:space="preserve"> Étape sept : les six boulons d'un demi-pouce par six pouces et demi. Un tour à la fois, dans l'ordre, de un à six. Regardez le compteur en haut à droite, pis la fenêtre en bas : à chaque tour, les ressorts s'allongent un peu.</w:t>
       </w:r>
     </w:p>
     <w:p>
@@ -2693,8 +3078,20 @@
       <w:r>
         <w:rPr>
           <w:rFonts w:ascii="Arial" w:cs="Arial" w:eastAsia="Arial" w:hAnsi="Arial"/>
-        </w:rPr>
-        <w:t xml:space="preserve">Les six boulons partagent la charge : les ressorts se détendent peu à peu, également. C'est plus long, mais on reste en contrôle.</w:t>
+          <w:i/>
+          <w:iCs/>
+          <w:strike w:val="false"/>
+          <w:color w:val="7B3FA0"/>
+          <w:sz w:val="19"/>
+          <w:szCs w:val="19"/>
+        </w:rPr>
+        <w:t xml:space="preserve">[calm]</w:t>
+      </w:r>
+      <w:r>
+        <w:rPr>
+          <w:rFonts w:ascii="Arial" w:cs="Arial" w:eastAsia="Arial" w:hAnsi="Arial"/>
+        </w:rPr>
+        <w:t xml:space="preserve"> Les six boulons partagent la charge : les ressorts se détendent peu à peu, également. C'est plus long, mais on reste en contrôle.</w:t>
       </w:r>
     </w:p>
     <w:p>
@@ -2727,8 +3124,92 @@
       <w:r>
         <w:rPr>
           <w:rFonts w:ascii="Arial" w:cs="Arial" w:eastAsia="Arial" w:hAnsi="Arial"/>
-        </w:rPr>
-        <w:t xml:space="preserve">Regardez ce qui arrive si on sort les boulons au complet, un après l'autre, sans s'occuper de l'énergie résiduelle. Les ressorts restent comprimés, pis chaque boulon enlevé laisse plus de charge aux autres. Le dernier porte toute la force : il casse, pis le cône est projeté. C'est pour ça qu'on y va un tour à la fois.</w:t>
+          <w:i/>
+          <w:iCs/>
+          <w:strike w:val="false"/>
+          <w:color w:val="7B3FA0"/>
+          <w:sz w:val="19"/>
+          <w:szCs w:val="19"/>
+        </w:rPr>
+        <w:t xml:space="preserve">[serious]</w:t>
+      </w:r>
+      <w:r>
+        <w:rPr>
+          <w:rFonts w:ascii="Arial" w:cs="Arial" w:eastAsia="Arial" w:hAnsi="Arial"/>
+        </w:rPr>
+        <w:t xml:space="preserve"> </w:t>
+      </w:r>
+      <w:r>
+        <w:rPr>
+          <w:rFonts w:ascii="Arial" w:cs="Arial" w:eastAsia="Arial" w:hAnsi="Arial"/>
+          <w:i/>
+          <w:iCs/>
+          <w:strike w:val="false"/>
+          <w:color w:val="7B3FA0"/>
+          <w:sz w:val="19"/>
+          <w:szCs w:val="19"/>
+        </w:rPr>
+        <w:t xml:space="preserve">[slowly]</w:t>
+      </w:r>
+      <w:r>
+        <w:rPr>
+          <w:rFonts w:ascii="Arial" w:cs="Arial" w:eastAsia="Arial" w:hAnsi="Arial"/>
+        </w:rPr>
+        <w:t xml:space="preserve"> Regardez ce qui arrive si on sort les boulons au complet, un après l'autre, sans s'occuper de l'énergie résiduelle. Les ressorts restent comprimés, pis chaque boulon enlevé laisse plus de charge aux autres. </w:t>
+      </w:r>
+      <w:r>
+        <w:rPr>
+          <w:rFonts w:ascii="Arial" w:cs="Arial" w:eastAsia="Arial" w:hAnsi="Arial"/>
+          <w:i/>
+          <w:iCs/>
+          <w:strike w:val="false"/>
+          <w:color w:val="7B3FA0"/>
+          <w:sz w:val="19"/>
+          <w:szCs w:val="19"/>
+        </w:rPr>
+        <w:t xml:space="preserve">[short pause]</w:t>
+      </w:r>
+      <w:r>
+        <w:rPr>
+          <w:rFonts w:ascii="Arial" w:cs="Arial" w:eastAsia="Arial" w:hAnsi="Arial"/>
+        </w:rPr>
+        <w:t xml:space="preserve"> Le dernier porte toute la force : il casse, pis le cône est projeté. </w:t>
+      </w:r>
+      <w:r>
+        <w:rPr>
+          <w:rFonts w:ascii="Arial" w:cs="Arial" w:eastAsia="Arial" w:hAnsi="Arial"/>
+          <w:i/>
+          <w:iCs/>
+          <w:strike w:val="false"/>
+          <w:color w:val="7B3FA0"/>
+          <w:sz w:val="19"/>
+          <w:szCs w:val="19"/>
+        </w:rPr>
+        <w:t xml:space="preserve">[pause]</w:t>
+      </w:r>
+      <w:r>
+        <w:rPr>
+          <w:rFonts w:ascii="Arial" w:cs="Arial" w:eastAsia="Arial" w:hAnsi="Arial"/>
+        </w:rPr>
+        <w:t xml:space="preserve"> </w:t>
+      </w:r>
+      <w:r>
+        <w:rPr>
+          <w:rFonts w:ascii="Arial" w:cs="Arial" w:eastAsia="Arial" w:hAnsi="Arial"/>
+          <w:i/>
+          <w:iCs/>
+          <w:strike w:val="false"/>
+          <w:color w:val="7B3FA0"/>
+          <w:sz w:val="19"/>
+          <w:szCs w:val="19"/>
+        </w:rPr>
+        <w:t xml:space="preserve">[calm]</w:t>
+      </w:r>
+      <w:r>
+        <w:rPr>
+          <w:rFonts w:ascii="Arial" w:cs="Arial" w:eastAsia="Arial" w:hAnsi="Arial"/>
+        </w:rPr>
+        <w:t xml:space="preserve"> C'est pour ça qu'on y va un tour à la fois.</w:t>
       </w:r>
     </w:p>
     <w:p>
@@ -2761,8 +3242,20 @@
       <w:r>
         <w:rPr>
           <w:rFonts w:ascii="Arial" w:cs="Arial" w:eastAsia="Arial" w:hAnsi="Arial"/>
-        </w:rPr>
-        <w:t xml:space="preserve">Étape huit : les ressorts sont détendus. On retire les trois boulons longs d'un demi-pouce par huit pouces.</w:t>
+          <w:i/>
+          <w:iCs/>
+          <w:strike w:val="false"/>
+          <w:color w:val="7B3FA0"/>
+          <w:sz w:val="19"/>
+          <w:szCs w:val="19"/>
+        </w:rPr>
+        <w:t xml:space="preserve">[calm]</w:t>
+      </w:r>
+      <w:r>
+        <w:rPr>
+          <w:rFonts w:ascii="Arial" w:cs="Arial" w:eastAsia="Arial" w:hAnsi="Arial"/>
+        </w:rPr>
+        <w:t xml:space="preserve"> Étape huit : les ressorts sont détendus. On retire les trois boulons longs d'un demi-pouce par huit pouces.</w:t>
       </w:r>
     </w:p>
     <w:p>
@@ -2795,8 +3288,20 @@
       <w:r>
         <w:rPr>
           <w:rFonts w:ascii="Arial" w:cs="Arial" w:eastAsia="Arial" w:hAnsi="Arial"/>
-        </w:rPr>
-        <w:t xml:space="preserve">On les garde pour la fin parce qu'ils retiennent le cône jusqu'au bout. Maintenant, ils ne portent plus rien.</w:t>
+          <w:i/>
+          <w:iCs/>
+          <w:strike w:val="false"/>
+          <w:color w:val="7B3FA0"/>
+          <w:sz w:val="19"/>
+          <w:szCs w:val="19"/>
+        </w:rPr>
+        <w:t xml:space="preserve">[calm]</w:t>
+      </w:r>
+      <w:r>
+        <w:rPr>
+          <w:rFonts w:ascii="Arial" w:cs="Arial" w:eastAsia="Arial" w:hAnsi="Arial"/>
+        </w:rPr>
+        <w:t xml:space="preserve"> On les garde pour la fin parce qu'ils retiennent le cône jusqu'au bout. Maintenant, ils ne portent plus rien.</w:t>
       </w:r>
     </w:p>
     <w:p>
@@ -2829,8 +3334,20 @@
       <w:r>
         <w:rPr>
           <w:rFonts w:ascii="Arial" w:cs="Arial" w:eastAsia="Arial" w:hAnsi="Arial"/>
-        </w:rPr>
-        <w:t xml:space="preserve">Étape neuf : on sort le cône, le bowl, pis les mâchoires, et on change les pièces. L'énergie résiduelle a été relâchée lentement : le cône est resté retenu tout le long.</w:t>
+          <w:i/>
+          <w:iCs/>
+          <w:strike w:val="false"/>
+          <w:color w:val="7B3FA0"/>
+          <w:sz w:val="19"/>
+          <w:szCs w:val="19"/>
+        </w:rPr>
+        <w:t xml:space="preserve">[calm]</w:t>
+      </w:r>
+      <w:r>
+        <w:rPr>
+          <w:rFonts w:ascii="Arial" w:cs="Arial" w:eastAsia="Arial" w:hAnsi="Arial"/>
+        </w:rPr>
+        <w:t xml:space="preserve"> Étape neuf : on sort le cône, le bowl, pis les mâchoires, et on change les pièces. L'énergie résiduelle a été relâchée lentement : le cône est resté retenu tout le long.</w:t>
       </w:r>
     </w:p>
     <w:p>
@@ -2908,12 +3425,24 @@
       <w:r>
         <w:rPr>
           <w:rFonts w:ascii="Arial" w:cs="Arial" w:eastAsia="Arial" w:hAnsi="Arial"/>
+          <w:i/>
+          <w:iCs/>
+          <w:strike w:val="false"/>
+          <w:color w:val="7B3FA0"/>
+          <w:sz w:val="19"/>
+          <w:szCs w:val="19"/>
+        </w:rPr>
+        <w:t xml:space="preserve">[calm]</w:t>
+      </w:r>
+      <w:r>
+        <w:rPr>
+          <w:rFonts w:ascii="Arial" w:cs="Arial" w:eastAsia="Arial" w:hAnsi="Arial"/>
           <w:b/>
           <w:bCs/>
           <w:color w:val="1E7B34"/>
           <w:u w:val="single" w:color="1E7B34"/>
         </w:rPr>
-        <w:t xml:space="preserve">Pour le remontage, on nettoie bien les deux côtés du couvercle avant de le remettre en place.</w:t>
+        <w:t xml:space="preserve"> Pour le remontage, on nettoie bien les deux côtés du couvercle avant de le remettre en place.</w:t>
       </w:r>
     </w:p>
     <w:p>
@@ -2946,12 +3475,24 @@
       <w:r>
         <w:rPr>
           <w:rFonts w:ascii="Arial" w:cs="Arial" w:eastAsia="Arial" w:hAnsi="Arial"/>
+          <w:i/>
+          <w:iCs/>
+          <w:strike w:val="false"/>
+          <w:color w:val="7B3FA0"/>
+          <w:sz w:val="19"/>
+          <w:szCs w:val="19"/>
+        </w:rPr>
+        <w:t xml:space="preserve">[serious]</w:t>
+      </w:r>
+      <w:r>
+        <w:rPr>
+          <w:rFonts w:ascii="Arial" w:cs="Arial" w:eastAsia="Arial" w:hAnsi="Arial"/>
           <w:b/>
           <w:bCs/>
           <w:color w:val="1E7B34"/>
           <w:u w:val="single" w:color="1E7B34"/>
         </w:rPr>
-        <w:t xml:space="preserve">Pour remettre le piston, on remet d'abord les trois boulons longs. Ensuite, on revisse les six autres dans l'ordre, un tour à la fois, pour pas écraser les ressorts juste d'un côté.</w:t>
+        <w:t xml:space="preserve"> Pour remettre le piston, on remet d'abord les trois boulons longs. Ensuite, on revisse les six autres dans l'ordre, un tour à la fois, pour pas écraser les ressorts juste d'un côté.</w:t>
       </w:r>
     </w:p>
     <w:p>
@@ -2984,12 +3525,24 @@
       <w:r>
         <w:rPr>
           <w:rFonts w:ascii="Arial" w:cs="Arial" w:eastAsia="Arial" w:hAnsi="Arial"/>
+          <w:i/>
+          <w:iCs/>
+          <w:strike w:val="false"/>
+          <w:color w:val="7B3FA0"/>
+          <w:sz w:val="19"/>
+          <w:szCs w:val="19"/>
+        </w:rPr>
+        <w:t xml:space="preserve">[curious]</w:t>
+      </w:r>
+      <w:r>
+        <w:rPr>
+          <w:rFonts w:ascii="Arial" w:cs="Arial" w:eastAsia="Arial" w:hAnsi="Arial"/>
           <w:b/>
           <w:bCs/>
           <w:color w:val="1E7B34"/>
           <w:u w:val="single" w:color="1E7B34"/>
         </w:rPr>
-        <w:t xml:space="preserve">Pis les neuf boulons du couvercle, on peut-tu les réutiliser ?</w:t>
+        <w:t xml:space="preserve"> Pis les neuf boulons du couvercle, on peut-tu les réutiliser ?</w:t>
       </w:r>
     </w:p>
     <w:p>
@@ -3022,12 +3575,24 @@
       <w:r>
         <w:rPr>
           <w:rFonts w:ascii="Arial" w:cs="Arial" w:eastAsia="Arial" w:hAnsi="Arial"/>
+          <w:i/>
+          <w:iCs/>
+          <w:strike w:val="false"/>
+          <w:color w:val="7B3FA0"/>
+          <w:sz w:val="19"/>
+          <w:szCs w:val="19"/>
+        </w:rPr>
+        <w:t xml:space="preserve">[confident]</w:t>
+      </w:r>
+      <w:r>
+        <w:rPr>
+          <w:rFonts w:ascii="Arial" w:cs="Arial" w:eastAsia="Arial" w:hAnsi="Arial"/>
           <w:b/>
           <w:bCs/>
           <w:color w:val="1E7B34"/>
           <w:u w:val="single" w:color="1E7B34"/>
         </w:rPr>
-        <w:t xml:space="preserve">Non. Dès qu'ils sont enlevés, on en remet des neufs. Pis on les serre à la clé dynamométrique, à cent cinq livres-pied.</w:t>
+        <w:t xml:space="preserve"> Non. Dès qu'ils sont enlevés, on en remet des neufs. Pis on les serre à la clé dynamométrique, à cent cinq livres-pied.</w:t>
       </w:r>
     </w:p>
     <w:p>
@@ -3074,12 +3639,68 @@
       <w:r>
         <w:rPr>
           <w:rFonts w:ascii="Arial" w:cs="Arial" w:eastAsia="Arial" w:hAnsi="Arial"/>
+          <w:i/>
+          <w:iCs/>
+          <w:strike w:val="false"/>
+          <w:color w:val="7B3FA0"/>
+          <w:sz w:val="19"/>
+          <w:szCs w:val="19"/>
+        </w:rPr>
+        <w:t xml:space="preserve">[calm]</w:t>
+      </w:r>
+      <w:r>
+        <w:rPr>
+          <w:rFonts w:ascii="Arial" w:cs="Arial" w:eastAsia="Arial" w:hAnsi="Arial"/>
           <w:b/>
           <w:bCs/>
           <w:color w:val="1E7B34"/>
           <w:u w:val="single" w:color="1E7B34"/>
         </w:rPr>
-        <w:t xml:space="preserve">Ce qu'il faut garder en tête : tant que le cône est boulonné, les ressorts poussent dessus. Les trois boulons longs sans bushing le retiennent, pis on relâche les six autres un tour à la fois, dans l'ordre. C'est comme ça que l'énergie sort tranquillement.</w:t>
+        <w:t xml:space="preserve"> Ce qu'il faut garder en tête : tant que le cône est boulonné, les ressorts poussent dessus. </w:t>
+      </w:r>
+      <w:r>
+        <w:rPr>
+          <w:rFonts w:ascii="Arial" w:cs="Arial" w:eastAsia="Arial" w:hAnsi="Arial"/>
+          <w:i/>
+          <w:iCs/>
+          <w:strike w:val="false"/>
+          <w:color w:val="7B3FA0"/>
+          <w:sz w:val="19"/>
+          <w:szCs w:val="19"/>
+        </w:rPr>
+        <w:t xml:space="preserve">[serious]</w:t>
+      </w:r>
+      <w:r>
+        <w:rPr>
+          <w:rFonts w:ascii="Arial" w:cs="Arial" w:eastAsia="Arial" w:hAnsi="Arial"/>
+          <w:b/>
+          <w:bCs/>
+          <w:color w:val="1E7B34"/>
+          <w:u w:val="single" w:color="1E7B34"/>
+        </w:rPr>
+        <w:t xml:space="preserve"> Les trois boulons longs sans bushing le retiennent, pis on relâche les six autres un tour à la fois, dans l'ordre. </w:t>
+      </w:r>
+      <w:r>
+        <w:rPr>
+          <w:rFonts w:ascii="Arial" w:cs="Arial" w:eastAsia="Arial" w:hAnsi="Arial"/>
+          <w:i/>
+          <w:iCs/>
+          <w:strike w:val="false"/>
+          <w:color w:val="7B3FA0"/>
+          <w:sz w:val="19"/>
+          <w:szCs w:val="19"/>
+        </w:rPr>
+        <w:t xml:space="preserve">[calm]</w:t>
+      </w:r>
+      <w:r>
+        <w:rPr>
+          <w:rFonts w:ascii="Arial" w:cs="Arial" w:eastAsia="Arial" w:hAnsi="Arial"/>
+          <w:b/>
+          <w:bCs/>
+          <w:color w:val="1E7B34"/>
+          <w:u w:val="single" w:color="1E7B34"/>
+        </w:rPr>
+        <w:t xml:space="preserve"> C'est comme ça que l'énergie sort tranquillement.</w:t>
       </w:r>
     </w:p>
     <w:p>
@@ -3112,8 +3733,20 @@
       <w:r>
         <w:rPr>
           <w:rFonts w:ascii="Arial" w:cs="Arial" w:eastAsia="Arial" w:hAnsi="Arial"/>
-        </w:rPr>
-        <w:t xml:space="preserve">Pendant que je dévisse, je me place où ?</w:t>
+          <w:i/>
+          <w:iCs/>
+          <w:strike w:val="false"/>
+          <w:color w:val="7B3FA0"/>
+          <w:sz w:val="19"/>
+          <w:szCs w:val="19"/>
+        </w:rPr>
+        <w:t xml:space="preserve">[curious]</w:t>
+      </w:r>
+      <w:r>
+        <w:rPr>
+          <w:rFonts w:ascii="Arial" w:cs="Arial" w:eastAsia="Arial" w:hAnsi="Arial"/>
+        </w:rPr>
+        <w:t xml:space="preserve"> Pendant que je dévisse, je me place où ?</w:t>
       </w:r>
     </w:p>
     <w:p>
@@ -3146,8 +3779,20 @@
       <w:r>
         <w:rPr>
           <w:rFonts w:ascii="Arial" w:cs="Arial" w:eastAsia="Arial" w:hAnsi="Arial"/>
-        </w:rPr>
-        <w:t xml:space="preserve">Hors de l'axe du mandrin. Jamais devant le cône : s'il part, c'est là qu'il s'en va.</w:t>
+          <w:i/>
+          <w:iCs/>
+          <w:strike w:val="false"/>
+          <w:color w:val="7B3FA0"/>
+          <w:sz w:val="19"/>
+          <w:szCs w:val="19"/>
+        </w:rPr>
+        <w:t xml:space="preserve">[serious]</w:t>
+      </w:r>
+      <w:r>
+        <w:rPr>
+          <w:rFonts w:ascii="Arial" w:cs="Arial" w:eastAsia="Arial" w:hAnsi="Arial"/>
+        </w:rPr>
+        <w:t xml:space="preserve"> Hors de l'axe du mandrin. Jamais devant le cône : s'il part, c'est là qu'il s'en va.</w:t>
       </w:r>
     </w:p>
     <w:p>
@@ -3180,8 +3825,20 @@
       <w:r>
         <w:rPr>
           <w:rFonts w:ascii="Arial" w:cs="Arial" w:eastAsia="Arial" w:hAnsi="Arial"/>
-        </w:rPr>
-        <w:t xml:space="preserve">Pis si un boulon veut pas se défaire ?</w:t>
+          <w:i/>
+          <w:iCs/>
+          <w:strike w:val="false"/>
+          <w:color w:val="7B3FA0"/>
+          <w:sz w:val="19"/>
+          <w:szCs w:val="19"/>
+        </w:rPr>
+        <w:t xml:space="preserve">[curious]</w:t>
+      </w:r>
+      <w:r>
+        <w:rPr>
+          <w:rFonts w:ascii="Arial" w:cs="Arial" w:eastAsia="Arial" w:hAnsi="Arial"/>
+        </w:rPr>
+        <w:t xml:space="preserve"> Pis si un boulon veut pas se défaire ?</w:t>
       </w:r>
     </w:p>
     <w:p>
@@ -3214,8 +3871,20 @@
       <w:r>
         <w:rPr>
           <w:rFonts w:ascii="Arial" w:cs="Arial" w:eastAsia="Arial" w:hAnsi="Arial"/>
-        </w:rPr>
-        <w:t xml:space="preserve">On force pas à l'impact drill sous charge. On arrête, pis on en parle au superviseur avant de continuer.</w:t>
+          <w:i/>
+          <w:iCs/>
+          <w:strike w:val="false"/>
+          <w:color w:val="7B3FA0"/>
+          <w:sz w:val="19"/>
+          <w:szCs w:val="19"/>
+        </w:rPr>
+        <w:t xml:space="preserve">[calm]</w:t>
+      </w:r>
+      <w:r>
+        <w:rPr>
+          <w:rFonts w:ascii="Arial" w:cs="Arial" w:eastAsia="Arial" w:hAnsi="Arial"/>
+        </w:rPr>
+        <w:t xml:space="preserve"> On force pas à l'impact drill sous charge. On arrête, pis on en parle au superviseur avant de continuer.</w:t>
       </w:r>
     </w:p>
     <w:p>
@@ -3248,8 +3917,20 @@
       <w:r>
         <w:rPr>
           <w:rFonts w:ascii="Arial" w:cs="Arial" w:eastAsia="Arial" w:hAnsi="Arial"/>
-        </w:rPr>
-        <w:t xml:space="preserve">Pis si le cône reste coincé ?</w:t>
+          <w:i/>
+          <w:iCs/>
+          <w:strike w:val="false"/>
+          <w:color w:val="7B3FA0"/>
+          <w:sz w:val="19"/>
+          <w:szCs w:val="19"/>
+        </w:rPr>
+        <w:t xml:space="preserve">[concerned]</w:t>
+      </w:r>
+      <w:r>
+        <w:rPr>
+          <w:rFonts w:ascii="Arial" w:cs="Arial" w:eastAsia="Arial" w:hAnsi="Arial"/>
+        </w:rPr>
+        <w:t xml:space="preserve"> Pis si le cône reste coincé ?</w:t>
       </w:r>
     </w:p>
     <w:p>
@@ -3282,8 +3963,20 @@
       <w:r>
         <w:rPr>
           <w:rFonts w:ascii="Arial" w:cs="Arial" w:eastAsia="Arial" w:hAnsi="Arial"/>
-        </w:rPr>
-        <w:t xml:space="preserve">On le frappe pas pour le décoincer, pis on reste pas devant. Les ressorts poussent encore : il peut être projeté.</w:t>
+          <w:i/>
+          <w:iCs/>
+          <w:strike w:val="false"/>
+          <w:color w:val="7B3FA0"/>
+          <w:sz w:val="19"/>
+          <w:szCs w:val="19"/>
+        </w:rPr>
+        <w:t xml:space="preserve">[serious]</w:t>
+      </w:r>
+      <w:r>
+        <w:rPr>
+          <w:rFonts w:ascii="Arial" w:cs="Arial" w:eastAsia="Arial" w:hAnsi="Arial"/>
+        </w:rPr>
+        <w:t xml:space="preserve"> On le frappe pas pour le décoincer, pis on reste pas devant. Les ressorts poussent encore : il peut être projeté.</w:t>
       </w:r>
     </w:p>
     <w:p>
@@ -3316,8 +4009,20 @@
       <w:r>
         <w:rPr>
           <w:rFonts w:ascii="Arial" w:cs="Arial" w:eastAsia="Arial" w:hAnsi="Arial"/>
-        </w:rPr>
-        <w:t xml:space="preserve">Si les boulons longs sont durs à remettre, on peut-tu sauter l'étape six ?</w:t>
+          <w:i/>
+          <w:iCs/>
+          <w:strike w:val="false"/>
+          <w:color w:val="7B3FA0"/>
+          <w:sz w:val="19"/>
+          <w:szCs w:val="19"/>
+        </w:rPr>
+        <w:t xml:space="preserve">[curious]</w:t>
+      </w:r>
+      <w:r>
+        <w:rPr>
+          <w:rFonts w:ascii="Arial" w:cs="Arial" w:eastAsia="Arial" w:hAnsi="Arial"/>
+        </w:rPr>
+        <w:t xml:space="preserve"> Si les boulons longs sont durs à remettre, on peut-tu sauter l'étape six ?</w:t>
       </w:r>
     </w:p>
     <w:p>
@@ -3350,8 +4055,20 @@
       <w:r>
         <w:rPr>
           <w:rFonts w:ascii="Arial" w:cs="Arial" w:eastAsia="Arial" w:hAnsi="Arial"/>
-        </w:rPr>
-        <w:t xml:space="preserve">Non. Ce sont eux qui retiennent le cône si quelque chose lâche. Sans eux, rien ne l'arrête.</w:t>
+          <w:i/>
+          <w:iCs/>
+          <w:strike w:val="false"/>
+          <w:color w:val="7B3FA0"/>
+          <w:sz w:val="19"/>
+          <w:szCs w:val="19"/>
+        </w:rPr>
+        <w:t xml:space="preserve">[confident]</w:t>
+      </w:r>
+      <w:r>
+        <w:rPr>
+          <w:rFonts w:ascii="Arial" w:cs="Arial" w:eastAsia="Arial" w:hAnsi="Arial"/>
+        </w:rPr>
+        <w:t xml:space="preserve"> Non. Ce sont eux qui retiennent le cône si quelque chose lâche. Sans eux, rien ne l'arrête.</w:t>
       </w:r>
     </w:p>
     <w:p>
@@ -3384,8 +4101,20 @@
       <w:r>
         <w:rPr>
           <w:rFonts w:ascii="Arial" w:cs="Arial" w:eastAsia="Arial" w:hAnsi="Arial"/>
-        </w:rPr>
-        <w:t xml:space="preserve">L'énergie résiduelle, y en a juste dans les ressorts ?</w:t>
+          <w:i/>
+          <w:iCs/>
+          <w:strike w:val="false"/>
+          <w:color w:val="7B3FA0"/>
+          <w:sz w:val="19"/>
+          <w:szCs w:val="19"/>
+        </w:rPr>
+        <w:t xml:space="preserve">[curious]</w:t>
+      </w:r>
+      <w:r>
+        <w:rPr>
+          <w:rFonts w:ascii="Arial" w:cs="Arial" w:eastAsia="Arial" w:hAnsi="Arial"/>
+        </w:rPr>
+        <w:t xml:space="preserve"> L'énergie résiduelle, y en a juste dans les ressorts ?</w:t>
       </w:r>
     </w:p>
     <w:p>
@@ -3418,8 +4147,38 @@
       <w:r>
         <w:rPr>
           <w:rFonts w:ascii="Arial" w:cs="Arial" w:eastAsia="Arial" w:hAnsi="Arial"/>
-        </w:rPr>
-        <w:t xml:space="preserve">Pas juste là. Il y a aussi la pression qui reste dans les boyaux hydrauliques, une pièce qui peut tomber, un câble tendu. Avant de démonter, on se demande toujours : qu'est-ce qui peut encore bouger ?</w:t>
+          <w:i/>
+          <w:iCs/>
+          <w:strike w:val="false"/>
+          <w:color w:val="7B3FA0"/>
+          <w:sz w:val="19"/>
+          <w:szCs w:val="19"/>
+        </w:rPr>
+        <w:t xml:space="preserve">[calm]</w:t>
+      </w:r>
+      <w:r>
+        <w:rPr>
+          <w:rFonts w:ascii="Arial" w:cs="Arial" w:eastAsia="Arial" w:hAnsi="Arial"/>
+        </w:rPr>
+        <w:t xml:space="preserve"> Pas juste là. Il y a aussi la pression qui reste dans les boyaux hydrauliques, une pièce qui peut tomber, un câble tendu. </w:t>
+      </w:r>
+      <w:r>
+        <w:rPr>
+          <w:rFonts w:ascii="Arial" w:cs="Arial" w:eastAsia="Arial" w:hAnsi="Arial"/>
+          <w:i/>
+          <w:iCs/>
+          <w:strike w:val="false"/>
+          <w:color w:val="7B3FA0"/>
+          <w:sz w:val="19"/>
+          <w:szCs w:val="19"/>
+        </w:rPr>
+        <w:t xml:space="preserve">[thoughtful]</w:t>
+      </w:r>
+      <w:r>
+        <w:rPr>
+          <w:rFonts w:ascii="Arial" w:cs="Arial" w:eastAsia="Arial" w:hAnsi="Arial"/>
+        </w:rPr>
+        <w:t xml:space="preserve"> Avant de démonter, on se demande toujours : qu'est-ce qui peut encore bouger ?</w:t>
       </w:r>
     </w:p>
     <w:p>
@@ -3452,8 +4211,20 @@
       <w:r>
         <w:rPr>
           <w:rFonts w:ascii="Arial" w:cs="Arial" w:eastAsia="Arial" w:hAnsi="Arial"/>
-        </w:rPr>
-        <w:t xml:space="preserve">Pis si le quart finit avant que la job soit faite ?</w:t>
+          <w:i/>
+          <w:iCs/>
+          <w:strike w:val="false"/>
+          <w:color w:val="7B3FA0"/>
+          <w:sz w:val="19"/>
+          <w:szCs w:val="19"/>
+        </w:rPr>
+        <w:t xml:space="preserve">[concerned]</w:t>
+      </w:r>
+      <w:r>
+        <w:rPr>
+          <w:rFonts w:ascii="Arial" w:cs="Arial" w:eastAsia="Arial" w:hAnsi="Arial"/>
+        </w:rPr>
+        <w:t xml:space="preserve"> Pis si le quart finit avant que la job soit faite ?</w:t>
       </w:r>
     </w:p>
     <w:p>
@@ -3486,8 +4257,38 @@
       <w:r>
         <w:rPr>
           <w:rFonts w:ascii="Arial" w:cs="Arial" w:eastAsia="Arial" w:hAnsi="Arial"/>
-        </w:rPr>
-        <w:t xml:space="preserve">On pose un scellé sur la foreuse, avec une fiche qui explique la nature de l'intervention. Après, chacun peut enlever son cadenas. Le prochain quart sait exactement où on est rendu, pis chacun repose son cadenas avant de reprendre la job. Sans ça, quelqu'un pourrait repartir la foreuse sans savoir que le mandrin est à moitié démonté, pis que les ressorts sont peut-être encore sous charge. Le cône pourrait être projeté.</w:t>
+          <w:i/>
+          <w:iCs/>
+          <w:strike w:val="false"/>
+          <w:color w:val="7B3FA0"/>
+          <w:sz w:val="19"/>
+          <w:szCs w:val="19"/>
+        </w:rPr>
+        <w:t xml:space="preserve">[calm]</w:t>
+      </w:r>
+      <w:r>
+        <w:rPr>
+          <w:rFonts w:ascii="Arial" w:cs="Arial" w:eastAsia="Arial" w:hAnsi="Arial"/>
+        </w:rPr>
+        <w:t xml:space="preserve"> On pose un scellé sur la foreuse, avec une fiche qui explique la nature de l'intervention. Après, chacun peut enlever son cadenas. Le prochain quart sait exactement où on est rendu, pis chacun repose son cadenas avant de reprendre la job. </w:t>
+      </w:r>
+      <w:r>
+        <w:rPr>
+          <w:rFonts w:ascii="Arial" w:cs="Arial" w:eastAsia="Arial" w:hAnsi="Arial"/>
+          <w:i/>
+          <w:iCs/>
+          <w:strike w:val="false"/>
+          <w:color w:val="7B3FA0"/>
+          <w:sz w:val="19"/>
+          <w:szCs w:val="19"/>
+        </w:rPr>
+        <w:t xml:space="preserve">[serious]</w:t>
+      </w:r>
+      <w:r>
+        <w:rPr>
+          <w:rFonts w:ascii="Arial" w:cs="Arial" w:eastAsia="Arial" w:hAnsi="Arial"/>
+        </w:rPr>
+        <w:t xml:space="preserve"> Sans ça, quelqu'un pourrait repartir la foreuse sans savoir que le mandrin est à moitié démonté, pis que les ressorts sont peut-être encore sous charge. Le cône pourrait être projeté.</w:t>
       </w:r>
     </w:p>
     <w:p>
@@ -3520,8 +4321,20 @@
       <w:r>
         <w:rPr>
           <w:rFonts w:ascii="Arial" w:cs="Arial" w:eastAsia="Arial" w:hAnsi="Arial"/>
-        </w:rPr>
-        <w:t xml:space="preserve">Pis si quelque chose me semble pas normal ?</w:t>
+          <w:i/>
+          <w:iCs/>
+          <w:strike w:val="false"/>
+          <w:color w:val="7B3FA0"/>
+          <w:sz w:val="19"/>
+          <w:szCs w:val="19"/>
+        </w:rPr>
+        <w:t xml:space="preserve">[curious]</w:t>
+      </w:r>
+      <w:r>
+        <w:rPr>
+          <w:rFonts w:ascii="Arial" w:cs="Arial" w:eastAsia="Arial" w:hAnsi="Arial"/>
+        </w:rPr>
+        <w:t xml:space="preserve"> Pis si quelque chose me semble pas normal ?</w:t>
       </w:r>
     </w:p>
     <w:p>
@@ -3554,8 +4367,20 @@
       <w:r>
         <w:rPr>
           <w:rFonts w:ascii="Arial" w:cs="Arial" w:eastAsia="Arial" w:hAnsi="Arial"/>
-        </w:rPr>
-        <w:t xml:space="preserve">Tu arrêtes, pis tu en parles au superviseur. On regarde ça ensemble avant de continuer.</w:t>
+          <w:i/>
+          <w:iCs/>
+          <w:strike w:val="false"/>
+          <w:color w:val="7B3FA0"/>
+          <w:sz w:val="19"/>
+          <w:szCs w:val="19"/>
+        </w:rPr>
+        <w:t xml:space="preserve">[reassuring]</w:t>
+      </w:r>
+      <w:r>
+        <w:rPr>
+          <w:rFonts w:ascii="Arial" w:cs="Arial" w:eastAsia="Arial" w:hAnsi="Arial"/>
+        </w:rPr>
+        <w:t xml:space="preserve"> Tu arrêtes, pis tu en parles au superviseur. On regarde ça ensemble avant de continuer.</w:t>
       </w:r>
     </w:p>
     <w:p>
@@ -3582,7 +4407,7 @@
           <w:sz w:val="20"/>
           <w:szCs w:val="20"/>
         </w:rPr>
-        <w:t xml:space="preserve">Mode dialogue, mêmes voix que la vidéo 1 (orateur 1 = Formateur, orateur 2 = Travailleur). Coller chaque bloc dans l’ordre, sans le nom de l’orateur ; garder les « … ». Seul le texte à enregistrer est ici : les 5 nouvelles répliques du mécanisme (blocs 1 à 3), le passage « Pourquoi fermées ? » de l’étape 1 (bloc 4) les 4 répliques du remontage (blocs 5 à 7) et la nouvelle réplique « Ce qu’il faut garder en tête » (bloc 8). Le reste est gardé de l’audio actuel.</w:t>
+        <w:t xml:space="preserve">Mode dialogue, mêmes voix que la vidéo 1 (orateur 1 = Formateur, orateur 2 = Travailleur). Coller chaque bloc dans l’ordre, sans le nom de l’orateur ; garder les « … » et les indications de ton entre crochets (balises ElevenLabs v3, en anglais). Seul le texte à enregistrer est ici : les 5 nouvelles répliques du mécanisme (blocs 1 à 3), le passage « Pourquoi fermées ? » de l’étape 1 (bloc 4) les 4 répliques du remontage (blocs 5 à 7) et la nouvelle réplique « Ce qu’il faut garder en tête » (bloc 8). Le reste est gardé de l’audio actuel.</w:t>
       </w:r>
     </w:p>
     <w:p>
@@ -3609,8 +4434,56 @@
       <w:r>
         <w:rPr>
           <w:rFonts w:ascii="Arial" w:cs="Arial" w:eastAsia="Arial" w:hAnsi="Arial"/>
-        </w:rPr>
-        <w:t xml:space="preserve">Avant de commencer, on regarde ce qu'il y a dans le mandrin. … Manettes ouvertes : l'huile pousse le piston, qui tire le cône vers l'arrière. Les ressorts s'écrasent, pis les mâchoires s'ouvrent. … Manettes fermées : la pression tombe. Les ressorts poussent le cône vers l'avant, pis son coin referme les mâchoires sur la tige. …</w:t>
+          <w:i/>
+          <w:iCs/>
+          <w:strike w:val="false"/>
+          <w:color w:val="7B3FA0"/>
+          <w:sz w:val="19"/>
+          <w:szCs w:val="19"/>
+        </w:rPr>
+        <w:t xml:space="preserve">[calm]</w:t>
+      </w:r>
+      <w:r>
+        <w:rPr>
+          <w:rFonts w:ascii="Arial" w:cs="Arial" w:eastAsia="Arial" w:hAnsi="Arial"/>
+        </w:rPr>
+        <w:t xml:space="preserve"> Avant de commencer, on regarde ce qu'il y a dans le mandrin. … </w:t>
+      </w:r>
+      <w:r>
+        <w:rPr>
+          <w:rFonts w:ascii="Arial" w:cs="Arial" w:eastAsia="Arial" w:hAnsi="Arial"/>
+          <w:i/>
+          <w:iCs/>
+          <w:strike w:val="false"/>
+          <w:color w:val="7B3FA0"/>
+          <w:sz w:val="19"/>
+          <w:szCs w:val="19"/>
+        </w:rPr>
+        <w:t xml:space="preserve">[serious]</w:t>
+      </w:r>
+      <w:r>
+        <w:rPr>
+          <w:rFonts w:ascii="Arial" w:cs="Arial" w:eastAsia="Arial" w:hAnsi="Arial"/>
+        </w:rPr>
+        <w:t xml:space="preserve"> Manettes ouvertes : l'huile pousse le piston, qui tire le cône vers l'arrière. Les ressorts s'écrasent, pis les mâchoires s'ouvrent. … </w:t>
+      </w:r>
+      <w:r>
+        <w:rPr>
+          <w:rFonts w:ascii="Arial" w:cs="Arial" w:eastAsia="Arial" w:hAnsi="Arial"/>
+          <w:i/>
+          <w:iCs/>
+          <w:strike w:val="false"/>
+          <w:color w:val="7B3FA0"/>
+          <w:sz w:val="19"/>
+          <w:szCs w:val="19"/>
+        </w:rPr>
+        <w:t xml:space="preserve">[calm]</w:t>
+      </w:r>
+      <w:r>
+        <w:rPr>
+          <w:rFonts w:ascii="Arial" w:cs="Arial" w:eastAsia="Arial" w:hAnsi="Arial"/>
+        </w:rPr>
+        <w:t xml:space="preserve"> Manettes fermées : la pression tombe. Les ressorts poussent le cône vers l'avant, pis son coin referme les mâchoires sur la tige. …</w:t>
       </w:r>
     </w:p>
     <w:p>
@@ -3637,8 +4510,20 @@
       <w:r>
         <w:rPr>
           <w:rFonts w:ascii="Arial" w:cs="Arial" w:eastAsia="Arial" w:hAnsi="Arial"/>
-        </w:rPr>
-        <w:t xml:space="preserve">Fait que les ressorts poussent tout le temps ? …</w:t>
+          <w:i/>
+          <w:iCs/>
+          <w:strike w:val="false"/>
+          <w:color w:val="7B3FA0"/>
+          <w:sz w:val="19"/>
+          <w:szCs w:val="19"/>
+        </w:rPr>
+        <w:t xml:space="preserve">[curious]</w:t>
+      </w:r>
+      <w:r>
+        <w:rPr>
+          <w:rFonts w:ascii="Arial" w:cs="Arial" w:eastAsia="Arial" w:hAnsi="Arial"/>
+        </w:rPr>
+        <w:t xml:space="preserve"> Fait que les ressorts poussent tout le temps ? …</w:t>
       </w:r>
     </w:p>
     <w:p>
@@ -3665,8 +4550,20 @@
       <w:r>
         <w:rPr>
           <w:rFonts w:ascii="Arial" w:cs="Arial" w:eastAsia="Arial" w:hAnsi="Arial"/>
-        </w:rPr>
-        <w:t xml:space="preserve">Tout le temps. Pis de l'extérieur, on voit rien : tout est caché dans le boîtier. …</w:t>
+          <w:i/>
+          <w:iCs/>
+          <w:strike w:val="false"/>
+          <w:color w:val="7B3FA0"/>
+          <w:sz w:val="19"/>
+          <w:szCs w:val="19"/>
+        </w:rPr>
+        <w:t xml:space="preserve">[serious]</w:t>
+      </w:r>
+      <w:r>
+        <w:rPr>
+          <w:rFonts w:ascii="Arial" w:cs="Arial" w:eastAsia="Arial" w:hAnsi="Arial"/>
+        </w:rPr>
+        <w:t xml:space="preserve"> Tout le temps. Pis de l'extérieur, on voit rien : tout est caché dans le boîtier. …</w:t>
       </w:r>
     </w:p>
     <w:p>
@@ -3693,8 +4590,56 @@
       <w:r>
         <w:rPr>
           <w:rFonts w:ascii="Arial" w:cs="Arial" w:eastAsia="Arial" w:hAnsi="Arial"/>
-        </w:rPr>
-        <w:t xml:space="preserve">Pourquoi fermées ? En position ouverte, l'hydraulique pousse le vérin, pis les ressorts sont écrasés au maximum. Si on cadenasse comme ça, le cadenas n'y change rien : toute cette énergie-là reste prise dans le mandrin. Fermées, les ressorts sont étirés au maximum : c'est là qu'il en reste le moins. …</w:t>
+          <w:i/>
+          <w:iCs/>
+          <w:strike w:val="false"/>
+          <w:color w:val="7B3FA0"/>
+          <w:sz w:val="19"/>
+          <w:szCs w:val="19"/>
+        </w:rPr>
+        <w:t xml:space="preserve">[calm]</w:t>
+      </w:r>
+      <w:r>
+        <w:rPr>
+          <w:rFonts w:ascii="Arial" w:cs="Arial" w:eastAsia="Arial" w:hAnsi="Arial"/>
+        </w:rPr>
+        <w:t xml:space="preserve"> Pourquoi fermées ? </w:t>
+      </w:r>
+      <w:r>
+        <w:rPr>
+          <w:rFonts w:ascii="Arial" w:cs="Arial" w:eastAsia="Arial" w:hAnsi="Arial"/>
+          <w:i/>
+          <w:iCs/>
+          <w:strike w:val="false"/>
+          <w:color w:val="7B3FA0"/>
+          <w:sz w:val="19"/>
+          <w:szCs w:val="19"/>
+        </w:rPr>
+        <w:t xml:space="preserve">[serious]</w:t>
+      </w:r>
+      <w:r>
+        <w:rPr>
+          <w:rFonts w:ascii="Arial" w:cs="Arial" w:eastAsia="Arial" w:hAnsi="Arial"/>
+        </w:rPr>
+        <w:t xml:space="preserve"> En position ouverte, l'hydraulique pousse le vérin, pis les ressorts sont écrasés au maximum. Si on cadenasse comme ça, le cadenas n'y change rien : toute cette énergie-là reste prise dans le mandrin. </w:t>
+      </w:r>
+      <w:r>
+        <w:rPr>
+          <w:rFonts w:ascii="Arial" w:cs="Arial" w:eastAsia="Arial" w:hAnsi="Arial"/>
+          <w:i/>
+          <w:iCs/>
+          <w:strike w:val="false"/>
+          <w:color w:val="7B3FA0"/>
+          <w:sz w:val="19"/>
+          <w:szCs w:val="19"/>
+        </w:rPr>
+        <w:t xml:space="preserve">[calm]</w:t>
+      </w:r>
+      <w:r>
+        <w:rPr>
+          <w:rFonts w:ascii="Arial" w:cs="Arial" w:eastAsia="Arial" w:hAnsi="Arial"/>
+        </w:rPr>
+        <w:t xml:space="preserve"> Fermées, les ressorts sont étirés au maximum : c'est là qu'il en reste le moins. …</w:t>
       </w:r>
     </w:p>
     <w:p>
@@ -3721,8 +4666,38 @@
       <w:r>
         <w:rPr>
           <w:rFonts w:ascii="Arial" w:cs="Arial" w:eastAsia="Arial" w:hAnsi="Arial"/>
-        </w:rPr>
-        <w:t xml:space="preserve">Pour le remontage, on nettoie bien les deux côtés du couvercle avant de le remettre en place. … Pour remettre le piston, on remet d'abord les trois boulons longs. Ensuite, on revisse les six autres dans l'ordre, un tour à la fois, pour pas écraser les ressorts juste d'un côté. …</w:t>
+          <w:i/>
+          <w:iCs/>
+          <w:strike w:val="false"/>
+          <w:color w:val="7B3FA0"/>
+          <w:sz w:val="19"/>
+          <w:szCs w:val="19"/>
+        </w:rPr>
+        <w:t xml:space="preserve">[calm]</w:t>
+      </w:r>
+      <w:r>
+        <w:rPr>
+          <w:rFonts w:ascii="Arial" w:cs="Arial" w:eastAsia="Arial" w:hAnsi="Arial"/>
+        </w:rPr>
+        <w:t xml:space="preserve"> Pour le remontage, on nettoie bien les deux côtés du couvercle avant de le remettre en place. … </w:t>
+      </w:r>
+      <w:r>
+        <w:rPr>
+          <w:rFonts w:ascii="Arial" w:cs="Arial" w:eastAsia="Arial" w:hAnsi="Arial"/>
+          <w:i/>
+          <w:iCs/>
+          <w:strike w:val="false"/>
+          <w:color w:val="7B3FA0"/>
+          <w:sz w:val="19"/>
+          <w:szCs w:val="19"/>
+        </w:rPr>
+        <w:t xml:space="preserve">[serious]</w:t>
+      </w:r>
+      <w:r>
+        <w:rPr>
+          <w:rFonts w:ascii="Arial" w:cs="Arial" w:eastAsia="Arial" w:hAnsi="Arial"/>
+        </w:rPr>
+        <w:t xml:space="preserve"> Pour remettre le piston, on remet d'abord les trois boulons longs. Ensuite, on revisse les six autres dans l'ordre, un tour à la fois, pour pas écraser les ressorts juste d'un côté. …</w:t>
       </w:r>
     </w:p>
     <w:p>
@@ -3749,8 +4724,20 @@
       <w:r>
         <w:rPr>
           <w:rFonts w:ascii="Arial" w:cs="Arial" w:eastAsia="Arial" w:hAnsi="Arial"/>
-        </w:rPr>
-        <w:t xml:space="preserve">Pis les neuf boulons du couvercle, on peut-tu les réutiliser ? …</w:t>
+          <w:i/>
+          <w:iCs/>
+          <w:strike w:val="false"/>
+          <w:color w:val="7B3FA0"/>
+          <w:sz w:val="19"/>
+          <w:szCs w:val="19"/>
+        </w:rPr>
+        <w:t xml:space="preserve">[curious]</w:t>
+      </w:r>
+      <w:r>
+        <w:rPr>
+          <w:rFonts w:ascii="Arial" w:cs="Arial" w:eastAsia="Arial" w:hAnsi="Arial"/>
+        </w:rPr>
+        <w:t xml:space="preserve"> Pis les neuf boulons du couvercle, on peut-tu les réutiliser ? …</w:t>
       </w:r>
     </w:p>
     <w:p>
@@ -3777,8 +4764,20 @@
       <w:r>
         <w:rPr>
           <w:rFonts w:ascii="Arial" w:cs="Arial" w:eastAsia="Arial" w:hAnsi="Arial"/>
-        </w:rPr>
-        <w:t xml:space="preserve">Non. Dès qu'ils sont enlevés, on en remet des neufs. Pis on les serre à la clé dynamométrique, à cent cinq livres-pied. …</w:t>
+          <w:i/>
+          <w:iCs/>
+          <w:strike w:val="false"/>
+          <w:color w:val="7B3FA0"/>
+          <w:sz w:val="19"/>
+          <w:szCs w:val="19"/>
+        </w:rPr>
+        <w:t xml:space="preserve">[confident]</w:t>
+      </w:r>
+      <w:r>
+        <w:rPr>
+          <w:rFonts w:ascii="Arial" w:cs="Arial" w:eastAsia="Arial" w:hAnsi="Arial"/>
+        </w:rPr>
+        <w:t xml:space="preserve"> Non. Dès qu'ils sont enlevés, on en remet des neufs. Pis on les serre à la clé dynamométrique, à cent cinq livres-pied. …</w:t>
       </w:r>
     </w:p>
     <w:p>
@@ -3805,8 +4804,56 @@
       <w:r>
         <w:rPr>
           <w:rFonts w:ascii="Arial" w:cs="Arial" w:eastAsia="Arial" w:hAnsi="Arial"/>
-        </w:rPr>
-        <w:t xml:space="preserve">Ce qu'il faut garder en tête : tant que le cône est boulonné, les ressorts poussent dessus. Les trois boulons longs sans bushing le retiennent, pis on relâche les six autres un tour à la fois, dans l'ordre. C'est comme ça que l'énergie sort tranquillement. …</w:t>
+          <w:i/>
+          <w:iCs/>
+          <w:strike w:val="false"/>
+          <w:color w:val="7B3FA0"/>
+          <w:sz w:val="19"/>
+          <w:szCs w:val="19"/>
+        </w:rPr>
+        <w:t xml:space="preserve">[calm]</w:t>
+      </w:r>
+      <w:r>
+        <w:rPr>
+          <w:rFonts w:ascii="Arial" w:cs="Arial" w:eastAsia="Arial" w:hAnsi="Arial"/>
+        </w:rPr>
+        <w:t xml:space="preserve"> Ce qu'il faut garder en tête : tant que le cône est boulonné, les ressorts poussent dessus. </w:t>
+      </w:r>
+      <w:r>
+        <w:rPr>
+          <w:rFonts w:ascii="Arial" w:cs="Arial" w:eastAsia="Arial" w:hAnsi="Arial"/>
+          <w:i/>
+          <w:iCs/>
+          <w:strike w:val="false"/>
+          <w:color w:val="7B3FA0"/>
+          <w:sz w:val="19"/>
+          <w:szCs w:val="19"/>
+        </w:rPr>
+        <w:t xml:space="preserve">[serious]</w:t>
+      </w:r>
+      <w:r>
+        <w:rPr>
+          <w:rFonts w:ascii="Arial" w:cs="Arial" w:eastAsia="Arial" w:hAnsi="Arial"/>
+        </w:rPr>
+        <w:t xml:space="preserve"> Les trois boulons longs sans bushing le retiennent, pis on relâche les six autres un tour à la fois, dans l'ordre. </w:t>
+      </w:r>
+      <w:r>
+        <w:rPr>
+          <w:rFonts w:ascii="Arial" w:cs="Arial" w:eastAsia="Arial" w:hAnsi="Arial"/>
+          <w:i/>
+          <w:iCs/>
+          <w:strike w:val="false"/>
+          <w:color w:val="7B3FA0"/>
+          <w:sz w:val="19"/>
+          <w:szCs w:val="19"/>
+        </w:rPr>
+        <w:t xml:space="preserve">[calm]</w:t>
+      </w:r>
+      <w:r>
+        <w:rPr>
+          <w:rFonts w:ascii="Arial" w:cs="Arial" w:eastAsia="Arial" w:hAnsi="Arial"/>
+        </w:rPr>
+        <w:t xml:space="preserve"> C'est comme ça que l'énergie sort tranquillement. …</w:t>
       </w:r>
     </w:p>
     <w:sectPr>

</xml_diff>